<commit_message>
Relatorio e implementacao - 3.3 Níveis de acesso à informação
</commit_message>
<xml_diff>
--- a/Relatório técnico-Fase1.docx
+++ b/Relatório técnico-Fase1.docx
@@ -58,7 +58,7 @@
       <w:tblPr>
         <w:tblW w:w="10358" w:type="dxa"/>
         <w:jc w:val="left"/>
-        <w:tblInd w:w="321" w:type="dxa"/>
+        <w:tblInd w:w="429" w:type="dxa"/>
         <w:tblBorders>
           <w:top w:val="single" w:color="ffffff" w:sz="8" w:space="0" w:shadow="0" w:frame="0"/>
           <w:left w:val="single" w:color="ffffff" w:sz="8" w:space="0" w:shadow="0" w:frame="0"/>
@@ -78,7 +78,7 @@
           <w:shd w:val="clear" w:color="auto" w:fill="d0ddef"/>
         </w:tblPrEx>
         <w:trPr>
-          <w:trHeight w:val="2570" w:hRule="atLeast"/>
+          <w:trHeight w:val="2580" w:hRule="atLeast"/>
         </w:trPr>
         <w:tc>
           <w:tcPr>
@@ -208,7 +208,7 @@
           <w:shd w:val="clear" w:color="auto" w:fill="d0ddef"/>
         </w:tblPrEx>
         <w:trPr>
-          <w:trHeight w:val="752" w:hRule="atLeast"/>
+          <w:trHeight w:val="762" w:hRule="atLeast"/>
         </w:trPr>
         <w:tc>
           <w:tcPr>
@@ -313,6 +313,14 @@
         <w:pStyle w:val="Body A"/>
         <w:widowControl w:val="0"/>
         <w:spacing w:after="0" w:line="240" w:lineRule="auto"/>
+        <w:ind w:left="321" w:hanging="321"/>
+      </w:pPr>
+    </w:p>
+    <w:p>
+      <w:pPr>
+        <w:pStyle w:val="Body A"/>
+        <w:widowControl w:val="0"/>
+        <w:spacing w:after="0" w:line="240" w:lineRule="auto"/>
         <w:ind w:left="213" w:hanging="213"/>
       </w:pPr>
     </w:p>
@@ -586,14 +594,8 @@
     <w:p>
       <w:pPr>
         <w:pStyle w:val="Heading"/>
-        <w:bidi w:val="0"/>
-        <w:ind w:left="0" w:right="0" w:firstLine="0"/>
-        <w:jc w:val="left"/>
         <w:rPr>
           <w:rFonts w:ascii="Arial Unicode MS" w:cs="Arial Unicode MS" w:hAnsi="Arial Unicode MS" w:eastAsia="Arial Unicode MS"/>
-          <w:sz w:val="32"/>
-          <w:szCs w:val="32"/>
-          <w:rtl w:val="0"/>
         </w:rPr>
       </w:pPr>
     </w:p>
@@ -604,24 +606,18 @@
       <w:r>
         <w:rPr>
           <w:rFonts w:ascii="Arial Unicode MS" w:cs="Arial Unicode MS" w:hAnsi="Arial Unicode MS" w:eastAsia="Arial Unicode MS"/>
-          <w:sz w:val="32"/>
-          <w:szCs w:val="32"/>
         </w:rPr>
         <w:fldChar w:fldCharType="begin" w:fldLock="0"/>
       </w:r>
       <w:r>
         <w:rPr>
           <w:rFonts w:ascii="Arial Unicode MS" w:cs="Arial Unicode MS" w:hAnsi="Arial Unicode MS" w:eastAsia="Arial Unicode MS"/>
-          <w:sz w:val="32"/>
-          <w:szCs w:val="32"/>
         </w:rPr>
         <w:instrText xml:space="preserve"> TOC \o 1-2 </w:instrText>
       </w:r>
       <w:r>
         <w:rPr>
           <w:rFonts w:ascii="Arial Unicode MS" w:cs="Arial Unicode MS" w:hAnsi="Arial Unicode MS" w:eastAsia="Arial Unicode MS"/>
-          <w:sz w:val="32"/>
-          <w:szCs w:val="32"/>
         </w:rPr>
         <w:fldChar w:fldCharType="separate" w:fldLock="0"/>
       </w:r>
@@ -633,7 +629,6 @@
           <w:ilvl w:val="0"/>
           <w:numId w:val="1"/>
         </w:numPr>
-        <w:bidi w:val="0"/>
       </w:pPr>
       <w:r>
         <w:rPr>
@@ -674,7 +669,6 @@
           <w:ilvl w:val="0"/>
           <w:numId w:val="2"/>
         </w:numPr>
-        <w:bidi w:val="0"/>
       </w:pPr>
       <w:r>
         <w:rPr>
@@ -715,7 +709,6 @@
           <w:ilvl w:val="0"/>
           <w:numId w:val="3"/>
         </w:numPr>
-        <w:bidi w:val="0"/>
       </w:pPr>
       <w:r>
         <w:rPr>
@@ -756,7 +749,6 @@
           <w:ilvl w:val="1"/>
           <w:numId w:val="1"/>
         </w:numPr>
-        <w:bidi w:val="0"/>
       </w:pPr>
       <w:r>
         <w:rPr>
@@ -797,7 +789,6 @@
           <w:ilvl w:val="1"/>
           <w:numId w:val="4"/>
         </w:numPr>
-        <w:bidi w:val="0"/>
       </w:pPr>
       <w:r>
         <w:rPr>
@@ -824,7 +815,7 @@
           <w:rFonts w:cs="Arial Unicode MS" w:eastAsia="Arial Unicode MS"/>
           <w:rtl w:val="0"/>
         </w:rPr>
-        <w:t>13</w:t>
+        <w:t>14</w:t>
       </w:r>
       <w:r>
         <w:rPr/>
@@ -838,7 +829,6 @@
           <w:ilvl w:val="0"/>
           <w:numId w:val="5"/>
         </w:numPr>
-        <w:bidi w:val="0"/>
       </w:pPr>
       <w:r>
         <w:rPr>
@@ -865,7 +855,7 @@
           <w:rFonts w:cs="Arial Unicode MS" w:eastAsia="Arial Unicode MS"/>
           <w:rtl w:val="0"/>
         </w:rPr>
-        <w:t>14</w:t>
+        <w:t>15</w:t>
       </w:r>
       <w:r>
         <w:rPr/>
@@ -879,7 +869,6 @@
           <w:ilvl w:val="1"/>
           <w:numId w:val="1"/>
         </w:numPr>
-        <w:bidi w:val="0"/>
       </w:pPr>
       <w:r>
         <w:rPr>
@@ -906,7 +895,7 @@
           <w:rFonts w:cs="Arial Unicode MS" w:eastAsia="Arial Unicode MS"/>
           <w:rtl w:val="0"/>
         </w:rPr>
-        <w:t>14</w:t>
+        <w:t>15</w:t>
       </w:r>
       <w:r>
         <w:rPr/>
@@ -920,7 +909,6 @@
           <w:ilvl w:val="1"/>
           <w:numId w:val="6"/>
         </w:numPr>
-        <w:bidi w:val="0"/>
       </w:pPr>
       <w:r>
         <w:rPr>
@@ -947,7 +935,7 @@
           <w:rFonts w:cs="Arial Unicode MS" w:eastAsia="Arial Unicode MS"/>
           <w:rtl w:val="0"/>
         </w:rPr>
-        <w:t>16</w:t>
+        <w:t>17</w:t>
       </w:r>
       <w:r>
         <w:rPr/>
@@ -961,7 +949,6 @@
           <w:ilvl w:val="1"/>
           <w:numId w:val="7"/>
         </w:numPr>
-        <w:bidi w:val="0"/>
       </w:pPr>
       <w:r>
         <w:rPr>
@@ -988,7 +975,7 @@
           <w:rFonts w:cs="Arial Unicode MS" w:eastAsia="Arial Unicode MS"/>
           <w:rtl w:val="0"/>
         </w:rPr>
-        <w:t>17</w:t>
+        <w:t>18</w:t>
       </w:r>
       <w:r>
         <w:rPr/>
@@ -1002,7 +989,6 @@
           <w:ilvl w:val="0"/>
           <w:numId w:val="8"/>
         </w:numPr>
-        <w:bidi w:val="0"/>
       </w:pPr>
       <w:r>
         <w:rPr>
@@ -1029,7 +1015,7 @@
           <w:rFonts w:cs="Arial Unicode MS" w:eastAsia="Arial Unicode MS"/>
           <w:rtl w:val="0"/>
         </w:rPr>
-        <w:t>17</w:t>
+        <w:t>18</w:t>
       </w:r>
       <w:r>
         <w:rPr/>
@@ -1043,7 +1029,6 @@
           <w:ilvl w:val="1"/>
           <w:numId w:val="1"/>
         </w:numPr>
-        <w:bidi w:val="0"/>
       </w:pPr>
       <w:r>
         <w:rPr>
@@ -1070,7 +1055,7 @@
           <w:rFonts w:cs="Arial Unicode MS" w:eastAsia="Arial Unicode MS"/>
           <w:rtl w:val="0"/>
         </w:rPr>
-        <w:t>18</w:t>
+        <w:t>19</w:t>
       </w:r>
       <w:r>
         <w:rPr/>
@@ -1084,7 +1069,6 @@
           <w:ilvl w:val="1"/>
           <w:numId w:val="9"/>
         </w:numPr>
-        <w:bidi w:val="0"/>
       </w:pPr>
       <w:r>
         <w:rPr>
@@ -1111,7 +1095,7 @@
           <w:rFonts w:cs="Arial Unicode MS" w:eastAsia="Arial Unicode MS"/>
           <w:rtl w:val="0"/>
         </w:rPr>
-        <w:t>28</w:t>
+        <w:t>29</w:t>
       </w:r>
       <w:r>
         <w:rPr/>
@@ -1125,7 +1109,6 @@
           <w:ilvl w:val="0"/>
           <w:numId w:val="10"/>
         </w:numPr>
-        <w:bidi w:val="0"/>
       </w:pPr>
       <w:r>
         <w:rPr>
@@ -1151,9 +1134,8 @@
         <w:rPr>
           <w:rFonts w:cs="Arial Unicode MS" w:eastAsia="Arial Unicode MS"/>
           <w:rtl w:val="0"/>
-          <w:lang w:val="ru-RU"/>
-        </w:rPr>
-        <w:t>34</w:t>
+        </w:rPr>
+        <w:t>35</w:t>
       </w:r>
       <w:r>
         <w:rPr/>
@@ -1167,7 +1149,6 @@
           <w:ilvl w:val="1"/>
           <w:numId w:val="10"/>
         </w:numPr>
-        <w:bidi w:val="0"/>
       </w:pPr>
       <w:r>
         <w:rPr>
@@ -1193,9 +1174,8 @@
         <w:rPr>
           <w:rFonts w:cs="Arial Unicode MS" w:eastAsia="Arial Unicode MS"/>
           <w:rtl w:val="0"/>
-          <w:lang w:val="ru-RU"/>
-        </w:rPr>
-        <w:t>34</w:t>
+        </w:rPr>
+        <w:t>35</w:t>
       </w:r>
       <w:r>
         <w:rPr/>
@@ -1209,7 +1189,6 @@
           <w:ilvl w:val="1"/>
           <w:numId w:val="11"/>
         </w:numPr>
-        <w:bidi w:val="0"/>
       </w:pPr>
       <w:r>
         <w:rPr>
@@ -1235,9 +1214,8 @@
         <w:rPr>
           <w:rFonts w:cs="Arial Unicode MS" w:eastAsia="Arial Unicode MS"/>
           <w:rtl w:val="0"/>
-          <w:lang w:val="ru-RU"/>
-        </w:rPr>
-        <w:t>34</w:t>
+        </w:rPr>
+        <w:t>35</w:t>
       </w:r>
       <w:r>
         <w:rPr/>
@@ -1251,7 +1229,6 @@
           <w:ilvl w:val="1"/>
           <w:numId w:val="12"/>
         </w:numPr>
-        <w:bidi w:val="0"/>
       </w:pPr>
       <w:r>
         <w:rPr>
@@ -1278,7 +1255,7 @@
           <w:rFonts w:cs="Arial Unicode MS" w:eastAsia="Arial Unicode MS"/>
           <w:rtl w:val="0"/>
         </w:rPr>
-        <w:t>35</w:t>
+        <w:t>36</w:t>
       </w:r>
       <w:r>
         <w:rPr/>
@@ -1292,7 +1269,6 @@
           <w:ilvl w:val="1"/>
           <w:numId w:val="13"/>
         </w:numPr>
-        <w:bidi w:val="0"/>
       </w:pPr>
       <w:r>
         <w:rPr>
@@ -1318,7 +1294,7 @@
           <w:rFonts w:cs="Arial Unicode MS" w:eastAsia="Arial Unicode MS"/>
           <w:rtl w:val="0"/>
         </w:rPr>
-        <w:t>36</w:t>
+        <w:t>38</w:t>
       </w:r>
       <w:r>
         <w:rPr/>
@@ -1332,7 +1308,6 @@
           <w:ilvl w:val="0"/>
           <w:numId w:val="14"/>
         </w:numPr>
-        <w:bidi w:val="0"/>
       </w:pPr>
       <w:r>
         <w:rPr>
@@ -1359,7 +1334,7 @@
           <w:rFonts w:cs="Arial Unicode MS" w:eastAsia="Arial Unicode MS"/>
           <w:rtl w:val="0"/>
         </w:rPr>
-        <w:t>37</w:t>
+        <w:t>38</w:t>
       </w:r>
       <w:r>
         <w:rPr/>
@@ -1373,7 +1348,6 @@
           <w:ilvl w:val="1"/>
           <w:numId w:val="1"/>
         </w:numPr>
-        <w:bidi w:val="0"/>
       </w:pPr>
       <w:r>
         <w:rPr>
@@ -1400,7 +1374,7 @@
           <w:rFonts w:cs="Arial Unicode MS" w:eastAsia="Arial Unicode MS"/>
           <w:rtl w:val="0"/>
         </w:rPr>
-        <w:t>37</w:t>
+        <w:t>38</w:t>
       </w:r>
       <w:r>
         <w:rPr/>
@@ -1414,7 +1388,6 @@
           <w:ilvl w:val="0"/>
           <w:numId w:val="15"/>
         </w:numPr>
-        <w:bidi w:val="0"/>
       </w:pPr>
       <w:r>
         <w:rPr>
@@ -1441,7 +1414,7 @@
           <w:rFonts w:cs="Arial Unicode MS" w:eastAsia="Arial Unicode MS"/>
           <w:rtl w:val="0"/>
         </w:rPr>
-        <w:t>37</w:t>
+        <w:t>39</w:t>
       </w:r>
       <w:r>
         <w:rPr/>
@@ -1455,7 +1428,6 @@
           <w:ilvl w:val="1"/>
           <w:numId w:val="1"/>
         </w:numPr>
-        <w:bidi w:val="0"/>
       </w:pPr>
       <w:r>
         <w:rPr>
@@ -1482,7 +1454,7 @@
           <w:rFonts w:cs="Arial Unicode MS" w:eastAsia="Arial Unicode MS"/>
           <w:rtl w:val="0"/>
         </w:rPr>
-        <w:t>37</w:t>
+        <w:t>39</w:t>
       </w:r>
       <w:r>
         <w:rPr/>
@@ -1496,7 +1468,6 @@
           <w:ilvl w:val="0"/>
           <w:numId w:val="16"/>
         </w:numPr>
-        <w:bidi w:val="0"/>
       </w:pPr>
       <w:r>
         <w:rPr>
@@ -1523,7 +1494,7 @@
           <w:rFonts w:cs="Arial Unicode MS" w:eastAsia="Arial Unicode MS"/>
           <w:rtl w:val="0"/>
         </w:rPr>
-        <w:t>38</w:t>
+        <w:t>39</w:t>
       </w:r>
       <w:r>
         <w:rPr/>
@@ -1537,8 +1508,6 @@
       <w:r>
         <w:rPr>
           <w:rFonts w:ascii="Arial Unicode MS" w:cs="Arial Unicode MS" w:hAnsi="Arial Unicode MS" w:eastAsia="Arial Unicode MS"/>
-          <w:sz w:val="32"/>
-          <w:szCs w:val="32"/>
         </w:rPr>
         <w:fldChar w:fldCharType="end" w:fldLock="0"/>
       </w:r>
@@ -2652,7 +2621,7 @@
       <w:tblPr>
         <w:tblW w:w="11062" w:type="dxa"/>
         <w:jc w:val="left"/>
-        <w:tblInd w:w="216" w:type="dxa"/>
+        <w:tblInd w:w="324" w:type="dxa"/>
         <w:tblBorders>
           <w:top w:val="single" w:color="ffffff" w:sz="8" w:space="0" w:shadow="0" w:frame="0"/>
           <w:left w:val="single" w:color="ffffff" w:sz="8" w:space="0" w:shadow="0" w:frame="0"/>
@@ -2674,7 +2643,7 @@
           <w:shd w:val="clear" w:color="auto" w:fill="d0ddef"/>
         </w:tblPrEx>
         <w:trPr>
-          <w:trHeight w:val="805" w:hRule="atLeast"/>
+          <w:trHeight w:val="825" w:hRule="atLeast"/>
         </w:trPr>
         <w:tc>
           <w:tcPr>
@@ -2870,7 +2839,7 @@
           <w:shd w:val="clear" w:color="auto" w:fill="d0ddef"/>
         </w:tblPrEx>
         <w:trPr>
-          <w:trHeight w:val="805" w:hRule="atLeast"/>
+          <w:trHeight w:val="825" w:hRule="atLeast"/>
         </w:trPr>
         <w:tc>
           <w:tcPr>
@@ -3024,7 +2993,7 @@
           <w:shd w:val="clear" w:color="auto" w:fill="d0ddef"/>
         </w:tblPrEx>
         <w:trPr>
-          <w:trHeight w:val="805" w:hRule="atLeast"/>
+          <w:trHeight w:val="825" w:hRule="atLeast"/>
         </w:trPr>
         <w:tc>
           <w:tcPr>
@@ -3194,7 +3163,7 @@
           <w:shd w:val="clear" w:color="auto" w:fill="d0ddef"/>
         </w:tblPrEx>
         <w:trPr>
-          <w:trHeight w:val="528" w:hRule="atLeast"/>
+          <w:trHeight w:val="548" w:hRule="atLeast"/>
         </w:trPr>
         <w:tc>
           <w:tcPr>
@@ -3348,7 +3317,7 @@
           <w:shd w:val="clear" w:color="auto" w:fill="d0ddef"/>
         </w:tblPrEx>
         <w:trPr>
-          <w:trHeight w:val="528" w:hRule="atLeast"/>
+          <w:trHeight w:val="548" w:hRule="atLeast"/>
         </w:trPr>
         <w:tc>
           <w:tcPr>
@@ -3534,7 +3503,7 @@
           <w:shd w:val="clear" w:color="auto" w:fill="d0ddef"/>
         </w:tblPrEx>
         <w:trPr>
-          <w:trHeight w:val="528" w:hRule="atLeast"/>
+          <w:trHeight w:val="548" w:hRule="atLeast"/>
         </w:trPr>
         <w:tc>
           <w:tcPr>
@@ -3704,7 +3673,7 @@
           <w:shd w:val="clear" w:color="auto" w:fill="d0ddef"/>
         </w:tblPrEx>
         <w:trPr>
-          <w:trHeight w:val="528" w:hRule="atLeast"/>
+          <w:trHeight w:val="548" w:hRule="atLeast"/>
         </w:trPr>
         <w:tc>
           <w:tcPr>
@@ -3842,7 +3811,7 @@
           <w:shd w:val="clear" w:color="auto" w:fill="d0ddef"/>
         </w:tblPrEx>
         <w:trPr>
-          <w:trHeight w:val="528" w:hRule="atLeast"/>
+          <w:trHeight w:val="548" w:hRule="atLeast"/>
         </w:trPr>
         <w:tc>
           <w:tcPr>
@@ -4012,7 +3981,7 @@
           <w:shd w:val="clear" w:color="auto" w:fill="d0ddef"/>
         </w:tblPrEx>
         <w:trPr>
-          <w:trHeight w:val="528" w:hRule="atLeast"/>
+          <w:trHeight w:val="548" w:hRule="atLeast"/>
         </w:trPr>
         <w:tc>
           <w:tcPr>
@@ -4166,7 +4135,7 @@
           <w:shd w:val="clear" w:color="auto" w:fill="d0ddef"/>
         </w:tblPrEx>
         <w:trPr>
-          <w:trHeight w:val="528" w:hRule="atLeast"/>
+          <w:trHeight w:val="548" w:hRule="atLeast"/>
         </w:trPr>
         <w:tc>
           <w:tcPr>
@@ -4368,7 +4337,7 @@
           <w:shd w:val="clear" w:color="auto" w:fill="d0ddef"/>
         </w:tblPrEx>
         <w:trPr>
-          <w:trHeight w:val="528" w:hRule="atLeast"/>
+          <w:trHeight w:val="548" w:hRule="atLeast"/>
         </w:trPr>
         <w:tc>
           <w:tcPr>
@@ -4534,7 +4503,452 @@
           </w:p>
         </w:tc>
       </w:tr>
+      <w:tr>
+        <w:tblPrEx>
+          <w:shd w:val="clear" w:color="auto" w:fill="d0ddef"/>
+        </w:tblPrEx>
+        <w:trPr>
+          <w:trHeight w:val="548" w:hRule="atLeast"/>
+        </w:trPr>
+        <w:tc>
+          <w:tcPr>
+            <w:tcW w:type="dxa" w:w="885"/>
+            <w:tcBorders>
+              <w:top w:val="single" w:color="4f81bd" w:sz="8" w:space="0" w:shadow="0" w:frame="0"/>
+              <w:left w:val="single" w:color="4f81bd" w:sz="8" w:space="0" w:shadow="0" w:frame="0"/>
+              <w:bottom w:val="single" w:color="4f81bd" w:sz="8" w:space="0" w:shadow="0" w:frame="0"/>
+              <w:right w:val="single" w:color="4f81bd" w:sz="8" w:space="0" w:shadow="0" w:frame="0"/>
+            </w:tcBorders>
+            <w:shd w:val="clear" w:color="auto" w:fill="auto"/>
+            <w:tcMar>
+              <w:top w:type="dxa" w:w="80"/>
+              <w:left w:type="dxa" w:w="80"/>
+              <w:bottom w:type="dxa" w:w="80"/>
+              <w:right w:type="dxa" w:w="80"/>
+            </w:tcMar>
+            <w:vAlign w:val="center"/>
+          </w:tcPr>
+          <w:p>
+            <w:pPr>
+              <w:keepNext w:val="0"/>
+              <w:keepLines w:val="0"/>
+              <w:pageBreakBefore w:val="0"/>
+              <w:widowControl w:val="1"/>
+              <w:shd w:val="clear" w:color="auto" w:fill="auto"/>
+              <w:suppressAutoHyphens w:val="0"/>
+              <w:bidi w:val="0"/>
+              <w:spacing w:before="0" w:after="160" w:line="259" w:lineRule="auto"/>
+              <w:ind w:left="0" w:right="0" w:firstLine="0"/>
+              <w:jc w:val="center"/>
+              <w:outlineLvl w:val="9"/>
+              <w:rPr>
+                <w:rtl w:val="0"/>
+              </w:rPr>
+            </w:pPr>
+            <w:r>
+              <w:rPr>
+                <w:rFonts w:ascii="Calibri" w:cs="Arial Unicode MS" w:hAnsi="Calibri" w:eastAsia="Arial Unicode MS"/>
+                <w:b w:val="0"/>
+                <w:bCs w:val="0"/>
+                <w:i w:val="0"/>
+                <w:iCs w:val="0"/>
+                <w:caps w:val="0"/>
+                <w:smallCaps w:val="0"/>
+                <w:strike w:val="0"/>
+                <w:dstrike w:val="0"/>
+                <w:outline w:val="0"/>
+                <w:color w:val="000000"/>
+                <w:spacing w:val="0"/>
+                <w:kern w:val="0"/>
+                <w:position w:val="0"/>
+                <w:sz w:val="22"/>
+                <w:szCs w:val="22"/>
+                <w:u w:val="none" w:color="000000"/>
+                <w:shd w:val="nil" w:color="auto" w:fill="auto"/>
+                <w:vertAlign w:val="baseline"/>
+                <w:rtl w:val="0"/>
+                <w14:textOutline w14:w="12700" w14:cap="flat">
+                  <w14:noFill/>
+                  <w14:miter w14:lim="400000"/>
+                </w14:textOutline>
+                <w14:textFill>
+                  <w14:solidFill>
+                    <w14:srgbClr w14:val="000000"/>
+                  </w14:solidFill>
+                </w14:textFill>
+              </w:rPr>
+              <w:t>R11</w:t>
+            </w:r>
+          </w:p>
+        </w:tc>
+        <w:tc>
+          <w:tcPr>
+            <w:tcW w:type="dxa" w:w="8755"/>
+            <w:tcBorders>
+              <w:top w:val="single" w:color="4f81bd" w:sz="8" w:space="0" w:shadow="0" w:frame="0"/>
+              <w:left w:val="single" w:color="4f81bd" w:sz="8" w:space="0" w:shadow="0" w:frame="0"/>
+              <w:bottom w:val="single" w:color="4f81bd" w:sz="8" w:space="0" w:shadow="0" w:frame="0"/>
+              <w:right w:val="single" w:color="4f81bd" w:sz="8" w:space="0" w:shadow="0" w:frame="0"/>
+            </w:tcBorders>
+            <w:shd w:val="clear" w:color="auto" w:fill="auto"/>
+            <w:tcMar>
+              <w:top w:type="dxa" w:w="80"/>
+              <w:left w:type="dxa" w:w="80"/>
+              <w:bottom w:type="dxa" w:w="80"/>
+              <w:right w:type="dxa" w:w="80"/>
+            </w:tcMar>
+            <w:vAlign w:val="center"/>
+          </w:tcPr>
+          <w:p>
+            <w:pPr>
+              <w:keepNext w:val="0"/>
+              <w:keepLines w:val="0"/>
+              <w:pageBreakBefore w:val="0"/>
+              <w:widowControl w:val="1"/>
+              <w:shd w:val="clear" w:color="auto" w:fill="auto"/>
+              <w:suppressAutoHyphens w:val="0"/>
+              <w:bidi w:val="0"/>
+              <w:spacing w:before="240" w:after="240" w:line="259" w:lineRule="auto"/>
+              <w:ind w:left="0" w:right="0" w:firstLine="0"/>
+              <w:jc w:val="left"/>
+              <w:outlineLvl w:val="9"/>
+              <w:rPr>
+                <w:rtl w:val="0"/>
+              </w:rPr>
+            </w:pPr>
+            <w:r>
+              <w:rPr>
+                <w:rFonts w:ascii="Calibri" w:cs="Arial Unicode MS" w:hAnsi="Calibri" w:eastAsia="Arial Unicode MS"/>
+                <w:b w:val="0"/>
+                <w:bCs w:val="0"/>
+                <w:i w:val="0"/>
+                <w:iCs w:val="0"/>
+                <w:caps w:val="0"/>
+                <w:smallCaps w:val="0"/>
+                <w:strike w:val="0"/>
+                <w:dstrike w:val="0"/>
+                <w:outline w:val="0"/>
+                <w:color w:val="000000"/>
+                <w:spacing w:val="0"/>
+                <w:kern w:val="0"/>
+                <w:position w:val="0"/>
+                <w:sz w:val="22"/>
+                <w:szCs w:val="22"/>
+                <w:u w:val="none" w:color="000000"/>
+                <w:shd w:val="nil" w:color="auto" w:fill="auto"/>
+                <w:vertAlign w:val="baseline"/>
+                <w:rtl w:val="0"/>
+                <w14:textOutline w14:w="12700" w14:cap="flat">
+                  <w14:noFill/>
+                  <w14:miter w14:lim="400000"/>
+                </w14:textOutline>
+                <w14:textFill>
+                  <w14:solidFill>
+                    <w14:srgbClr w14:val="000000"/>
+                  </w14:solidFill>
+                </w14:textFill>
+              </w:rPr>
+              <w:t>O g</w:t>
+            </w:r>
+            <w:r>
+              <w:rPr>
+                <w:rFonts w:ascii="Calibri" w:cs="Arial Unicode MS" w:hAnsi="Calibri" w:eastAsia="Arial Unicode MS" w:hint="default"/>
+                <w:b w:val="0"/>
+                <w:bCs w:val="0"/>
+                <w:i w:val="0"/>
+                <w:iCs w:val="0"/>
+                <w:caps w:val="0"/>
+                <w:smallCaps w:val="0"/>
+                <w:strike w:val="0"/>
+                <w:dstrike w:val="0"/>
+                <w:outline w:val="0"/>
+                <w:color w:val="000000"/>
+                <w:spacing w:val="0"/>
+                <w:kern w:val="0"/>
+                <w:position w:val="0"/>
+                <w:sz w:val="22"/>
+                <w:szCs w:val="22"/>
+                <w:u w:val="none" w:color="000000"/>
+                <w:shd w:val="nil" w:color="auto" w:fill="auto"/>
+                <w:vertAlign w:val="baseline"/>
+                <w:rtl w:val="0"/>
+                <w14:textOutline w14:w="12700" w14:cap="flat">
+                  <w14:noFill/>
+                  <w14:miter w14:lim="400000"/>
+                </w14:textOutline>
+                <w14:textFill>
+                  <w14:solidFill>
+                    <w14:srgbClr w14:val="000000"/>
+                  </w14:solidFill>
+                </w14:textFill>
+              </w:rPr>
+              <w:t>é</w:t>
+            </w:r>
+            <w:r>
+              <w:rPr>
+                <w:rFonts w:ascii="Calibri" w:cs="Arial Unicode MS" w:hAnsi="Calibri" w:eastAsia="Arial Unicode MS"/>
+                <w:b w:val="0"/>
+                <w:bCs w:val="0"/>
+                <w:i w:val="0"/>
+                <w:iCs w:val="0"/>
+                <w:caps w:val="0"/>
+                <w:smallCaps w:val="0"/>
+                <w:strike w:val="0"/>
+                <w:dstrike w:val="0"/>
+                <w:outline w:val="0"/>
+                <w:color w:val="000000"/>
+                <w:spacing w:val="0"/>
+                <w:kern w:val="0"/>
+                <w:position w:val="0"/>
+                <w:sz w:val="22"/>
+                <w:szCs w:val="22"/>
+                <w:u w:val="none" w:color="000000"/>
+                <w:shd w:val="nil" w:color="auto" w:fill="auto"/>
+                <w:vertAlign w:val="baseline"/>
+                <w:rtl w:val="0"/>
+                <w14:textOutline w14:w="12700" w14:cap="flat">
+                  <w14:noFill/>
+                  <w14:miter w14:lim="400000"/>
+                </w14:textOutline>
+                <w14:textFill>
+                  <w14:solidFill>
+                    <w14:srgbClr w14:val="000000"/>
+                  </w14:solidFill>
+                </w14:textFill>
+              </w:rPr>
+              <w:t xml:space="preserve">nero de um Customer </w:t>
+            </w:r>
+            <w:r>
+              <w:rPr>
+                <w:rFonts w:ascii="Calibri" w:cs="Arial Unicode MS" w:hAnsi="Calibri" w:eastAsia="Arial Unicode MS" w:hint="default"/>
+                <w:b w:val="0"/>
+                <w:bCs w:val="0"/>
+                <w:i w:val="0"/>
+                <w:iCs w:val="0"/>
+                <w:caps w:val="0"/>
+                <w:smallCaps w:val="0"/>
+                <w:strike w:val="0"/>
+                <w:dstrike w:val="0"/>
+                <w:outline w:val="0"/>
+                <w:color w:val="000000"/>
+                <w:spacing w:val="0"/>
+                <w:kern w:val="0"/>
+                <w:position w:val="0"/>
+                <w:sz w:val="22"/>
+                <w:szCs w:val="22"/>
+                <w:u w:val="none" w:color="000000"/>
+                <w:shd w:val="nil" w:color="auto" w:fill="auto"/>
+                <w:vertAlign w:val="baseline"/>
+                <w:rtl w:val="0"/>
+                <w14:textOutline w14:w="12700" w14:cap="flat">
+                  <w14:noFill/>
+                  <w14:miter w14:lim="400000"/>
+                </w14:textOutline>
+                <w14:textFill>
+                  <w14:solidFill>
+                    <w14:srgbClr w14:val="000000"/>
+                  </w14:solidFill>
+                </w14:textFill>
+              </w:rPr>
+              <w:t xml:space="preserve">é </w:t>
+            </w:r>
+            <w:r>
+              <w:rPr>
+                <w:rFonts w:ascii="Calibri" w:cs="Arial Unicode MS" w:hAnsi="Calibri" w:eastAsia="Arial Unicode MS"/>
+                <w:b w:val="0"/>
+                <w:bCs w:val="0"/>
+                <w:i w:val="0"/>
+                <w:iCs w:val="0"/>
+                <w:caps w:val="0"/>
+                <w:smallCaps w:val="0"/>
+                <w:strike w:val="0"/>
+                <w:dstrike w:val="0"/>
+                <w:outline w:val="0"/>
+                <w:color w:val="000000"/>
+                <w:spacing w:val="0"/>
+                <w:kern w:val="0"/>
+                <w:position w:val="0"/>
+                <w:sz w:val="22"/>
+                <w:szCs w:val="22"/>
+                <w:u w:val="none" w:color="000000"/>
+                <w:shd w:val="nil" w:color="auto" w:fill="auto"/>
+                <w:vertAlign w:val="baseline"/>
+                <w:rtl w:val="0"/>
+                <w14:textOutline w14:w="12700" w14:cap="flat">
+                  <w14:noFill/>
+                  <w14:miter w14:lim="400000"/>
+                </w14:textOutline>
+                <w14:textFill>
+                  <w14:solidFill>
+                    <w14:srgbClr w14:val="000000"/>
+                  </w14:solidFill>
+                </w14:textFill>
+              </w:rPr>
+              <w:t>opcional e pode n</w:t>
+            </w:r>
+            <w:r>
+              <w:rPr>
+                <w:rFonts w:ascii="Calibri" w:cs="Arial Unicode MS" w:hAnsi="Calibri" w:eastAsia="Arial Unicode MS" w:hint="default"/>
+                <w:b w:val="0"/>
+                <w:bCs w:val="0"/>
+                <w:i w:val="0"/>
+                <w:iCs w:val="0"/>
+                <w:caps w:val="0"/>
+                <w:smallCaps w:val="0"/>
+                <w:strike w:val="0"/>
+                <w:dstrike w:val="0"/>
+                <w:outline w:val="0"/>
+                <w:color w:val="000000"/>
+                <w:spacing w:val="0"/>
+                <w:kern w:val="0"/>
+                <w:position w:val="0"/>
+                <w:sz w:val="22"/>
+                <w:szCs w:val="22"/>
+                <w:u w:val="none" w:color="000000"/>
+                <w:shd w:val="nil" w:color="auto" w:fill="auto"/>
+                <w:vertAlign w:val="baseline"/>
+                <w:rtl w:val="0"/>
+                <w14:textOutline w14:w="12700" w14:cap="flat">
+                  <w14:noFill/>
+                  <w14:miter w14:lim="400000"/>
+                </w14:textOutline>
+                <w14:textFill>
+                  <w14:solidFill>
+                    <w14:srgbClr w14:val="000000"/>
+                  </w14:solidFill>
+                </w14:textFill>
+              </w:rPr>
+              <w:t>ã</w:t>
+            </w:r>
+            <w:r>
+              <w:rPr>
+                <w:rFonts w:ascii="Calibri" w:cs="Arial Unicode MS" w:hAnsi="Calibri" w:eastAsia="Arial Unicode MS"/>
+                <w:b w:val="0"/>
+                <w:bCs w:val="0"/>
+                <w:i w:val="0"/>
+                <w:iCs w:val="0"/>
+                <w:caps w:val="0"/>
+                <w:smallCaps w:val="0"/>
+                <w:strike w:val="0"/>
+                <w:dstrike w:val="0"/>
+                <w:outline w:val="0"/>
+                <w:color w:val="000000"/>
+                <w:spacing w:val="0"/>
+                <w:kern w:val="0"/>
+                <w:position w:val="0"/>
+                <w:sz w:val="22"/>
+                <w:szCs w:val="22"/>
+                <w:u w:val="none" w:color="000000"/>
+                <w:shd w:val="nil" w:color="auto" w:fill="auto"/>
+                <w:vertAlign w:val="baseline"/>
+                <w:rtl w:val="0"/>
+                <w14:textOutline w14:w="12700" w14:cap="flat">
+                  <w14:noFill/>
+                  <w14:miter w14:lim="400000"/>
+                </w14:textOutline>
+                <w14:textFill>
+                  <w14:solidFill>
+                    <w14:srgbClr w14:val="000000"/>
+                  </w14:solidFill>
+                </w14:textFill>
+              </w:rPr>
+              <w:t>o ser inserido</w:t>
+            </w:r>
+          </w:p>
+        </w:tc>
+        <w:tc>
+          <w:tcPr>
+            <w:tcW w:type="dxa" w:w="1422"/>
+            <w:tcBorders>
+              <w:top w:val="single" w:color="4f81bd" w:sz="8" w:space="0" w:shadow="0" w:frame="0"/>
+              <w:left w:val="single" w:color="4f81bd" w:sz="8" w:space="0" w:shadow="0" w:frame="0"/>
+              <w:bottom w:val="single" w:color="4f81bd" w:sz="8" w:space="0" w:shadow="0" w:frame="0"/>
+              <w:right w:val="single" w:color="4f81bd" w:sz="8" w:space="0" w:shadow="0" w:frame="0"/>
+            </w:tcBorders>
+            <w:shd w:val="clear" w:color="auto" w:fill="auto"/>
+            <w:tcMar>
+              <w:top w:type="dxa" w:w="80"/>
+              <w:left w:type="dxa" w:w="80"/>
+              <w:bottom w:type="dxa" w:w="80"/>
+              <w:right w:type="dxa" w:w="80"/>
+            </w:tcMar>
+            <w:vAlign w:val="center"/>
+          </w:tcPr>
+          <w:p>
+            <w:pPr>
+              <w:keepNext w:val="0"/>
+              <w:keepLines w:val="0"/>
+              <w:pageBreakBefore w:val="0"/>
+              <w:widowControl w:val="1"/>
+              <w:shd w:val="clear" w:color="auto" w:fill="auto"/>
+              <w:suppressAutoHyphens w:val="0"/>
+              <w:bidi w:val="0"/>
+              <w:spacing w:before="0" w:after="160" w:line="259" w:lineRule="auto"/>
+              <w:ind w:left="0" w:right="0" w:firstLine="0"/>
+              <w:jc w:val="center"/>
+              <w:outlineLvl w:val="9"/>
+              <w:rPr>
+                <w:rtl w:val="0"/>
+              </w:rPr>
+            </w:pPr>
+            <w:r>
+              <w:rPr>
+                <w:rFonts w:ascii="Calibri" w:cs="Arial Unicode MS" w:hAnsi="Calibri" w:eastAsia="Arial Unicode MS"/>
+                <w:b w:val="0"/>
+                <w:bCs w:val="0"/>
+                <w:i w:val="0"/>
+                <w:iCs w:val="0"/>
+                <w:caps w:val="0"/>
+                <w:smallCaps w:val="0"/>
+                <w:strike w:val="0"/>
+                <w:dstrike w:val="0"/>
+                <w:outline w:val="0"/>
+                <w:color w:val="000000"/>
+                <w:spacing w:val="0"/>
+                <w:kern w:val="0"/>
+                <w:position w:val="0"/>
+                <w:sz w:val="22"/>
+                <w:szCs w:val="22"/>
+                <w:u w:val="none" w:color="000000"/>
+                <w:shd w:val="nil" w:color="auto" w:fill="auto"/>
+                <w:vertAlign w:val="baseline"/>
+                <w:rtl w:val="0"/>
+                <w14:textOutline w14:w="12700" w14:cap="flat">
+                  <w14:noFill/>
+                  <w14:miter w14:lim="400000"/>
+                </w14:textOutline>
+                <w14:textFill>
+                  <w14:solidFill>
+                    <w14:srgbClr w14:val="000000"/>
+                  </w14:solidFill>
+                </w14:textFill>
+              </w:rPr>
+              <w:t>S</w:t>
+            </w:r>
+          </w:p>
+        </w:tc>
+      </w:tr>
     </w:tbl>
+    <w:p>
+      <w:pPr>
+        <w:pStyle w:val="Body A"/>
+        <w:widowControl w:val="0"/>
+        <w:spacing w:line="240" w:lineRule="auto"/>
+        <w:ind w:left="216" w:hanging="216"/>
+        <w:rPr>
+          <w:i w:val="1"/>
+          <w:iCs w:val="1"/>
+          <w:outline w:val="0"/>
+          <w:color w:val="a6a6a6"/>
+          <w:u w:color="a6a6a6"/>
+          <w14:textFill>
+            <w14:solidFill>
+              <w14:srgbClr w14:val="A6A6A6"/>
+            </w14:solidFill>
+          </w14:textFill>
+        </w:rPr>
+      </w:pPr>
+    </w:p>
     <w:p>
       <w:pPr>
         <w:pStyle w:val="Body A"/>
@@ -29319,7 +29733,7 @@
       <w:tblPr>
         <w:tblW w:w="10440" w:type="dxa"/>
         <w:jc w:val="left"/>
-        <w:tblInd w:w="216" w:type="dxa"/>
+        <w:tblInd w:w="324" w:type="dxa"/>
         <w:tblBorders>
           <w:top w:val="single" w:color="ffffff" w:sz="8" w:space="0" w:shadow="0" w:frame="0"/>
           <w:left w:val="single" w:color="ffffff" w:sz="8" w:space="0" w:shadow="0" w:frame="0"/>
@@ -29341,7 +29755,7 @@
           <w:shd w:val="clear" w:color="auto" w:fill="d0ddef"/>
         </w:tblPrEx>
         <w:trPr>
-          <w:trHeight w:val="251" w:hRule="atLeast"/>
+          <w:trHeight w:val="271" w:hRule="atLeast"/>
         </w:trPr>
         <w:tc>
           <w:tcPr>
@@ -29533,7 +29947,7 @@
           <w:shd w:val="clear" w:color="auto" w:fill="d0ddef"/>
         </w:tblPrEx>
         <w:trPr>
-          <w:trHeight w:val="231" w:hRule="atLeast"/>
+          <w:trHeight w:val="251" w:hRule="atLeast"/>
         </w:trPr>
         <w:tc>
           <w:tcPr>
@@ -29637,7 +30051,7 @@
           <w:shd w:val="clear" w:color="auto" w:fill="d0ddef"/>
         </w:tblPrEx>
         <w:trPr>
-          <w:trHeight w:val="231" w:hRule="atLeast"/>
+          <w:trHeight w:val="251" w:hRule="atLeast"/>
         </w:trPr>
         <w:tc>
           <w:tcPr>
@@ -29741,7 +30155,7 @@
           <w:shd w:val="clear" w:color="auto" w:fill="d0ddef"/>
         </w:tblPrEx>
         <w:trPr>
-          <w:trHeight w:val="231" w:hRule="atLeast"/>
+          <w:trHeight w:val="251" w:hRule="atLeast"/>
         </w:trPr>
         <w:tc>
           <w:tcPr>
@@ -29845,7 +30259,7 @@
           <w:shd w:val="clear" w:color="auto" w:fill="d0ddef"/>
         </w:tblPrEx>
         <w:trPr>
-          <w:trHeight w:val="231" w:hRule="atLeast"/>
+          <w:trHeight w:val="251" w:hRule="atLeast"/>
         </w:trPr>
         <w:tc>
           <w:tcPr>
@@ -29949,7 +30363,7 @@
           <w:shd w:val="clear" w:color="auto" w:fill="d0ddef"/>
         </w:tblPrEx>
         <w:trPr>
-          <w:trHeight w:val="231" w:hRule="atLeast"/>
+          <w:trHeight w:val="251" w:hRule="atLeast"/>
         </w:trPr>
         <w:tc>
           <w:tcPr>
@@ -30053,7 +30467,7 @@
           <w:shd w:val="clear" w:color="auto" w:fill="d0ddef"/>
         </w:tblPrEx>
         <w:trPr>
-          <w:trHeight w:val="231" w:hRule="atLeast"/>
+          <w:trHeight w:val="251" w:hRule="atLeast"/>
         </w:trPr>
         <w:tc>
           <w:tcPr>
@@ -30157,7 +30571,7 @@
           <w:shd w:val="clear" w:color="auto" w:fill="d0ddef"/>
         </w:tblPrEx>
         <w:trPr>
-          <w:trHeight w:val="231" w:hRule="atLeast"/>
+          <w:trHeight w:val="251" w:hRule="atLeast"/>
         </w:trPr>
         <w:tc>
           <w:tcPr>
@@ -30261,7 +30675,7 @@
           <w:shd w:val="clear" w:color="auto" w:fill="d0ddef"/>
         </w:tblPrEx>
         <w:trPr>
-          <w:trHeight w:val="231" w:hRule="atLeast"/>
+          <w:trHeight w:val="251" w:hRule="atLeast"/>
         </w:trPr>
         <w:tc>
           <w:tcPr>
@@ -30365,7 +30779,7 @@
           <w:shd w:val="clear" w:color="auto" w:fill="d0ddef"/>
         </w:tblPrEx>
         <w:trPr>
-          <w:trHeight w:val="231" w:hRule="atLeast"/>
+          <w:trHeight w:val="251" w:hRule="atLeast"/>
         </w:trPr>
         <w:tc>
           <w:tcPr>
@@ -30469,7 +30883,7 @@
           <w:shd w:val="clear" w:color="auto" w:fill="d0ddef"/>
         </w:tblPrEx>
         <w:trPr>
-          <w:trHeight w:val="231" w:hRule="atLeast"/>
+          <w:trHeight w:val="251" w:hRule="atLeast"/>
         </w:trPr>
         <w:tc>
           <w:tcPr>
@@ -30573,7 +30987,7 @@
           <w:shd w:val="clear" w:color="auto" w:fill="d0ddef"/>
         </w:tblPrEx>
         <w:trPr>
-          <w:trHeight w:val="231" w:hRule="atLeast"/>
+          <w:trHeight w:val="251" w:hRule="atLeast"/>
         </w:trPr>
         <w:tc>
           <w:tcPr>
@@ -30677,7 +31091,7 @@
           <w:shd w:val="clear" w:color="auto" w:fill="d0ddef"/>
         </w:tblPrEx>
         <w:trPr>
-          <w:trHeight w:val="231" w:hRule="atLeast"/>
+          <w:trHeight w:val="251" w:hRule="atLeast"/>
         </w:trPr>
         <w:tc>
           <w:tcPr>
@@ -30781,7 +31195,7 @@
           <w:shd w:val="clear" w:color="auto" w:fill="d0ddef"/>
         </w:tblPrEx>
         <w:trPr>
-          <w:trHeight w:val="231" w:hRule="atLeast"/>
+          <w:trHeight w:val="251" w:hRule="atLeast"/>
         </w:trPr>
         <w:tc>
           <w:tcPr>
@@ -30885,7 +31299,7 @@
           <w:shd w:val="clear" w:color="auto" w:fill="d0ddef"/>
         </w:tblPrEx>
         <w:trPr>
-          <w:trHeight w:val="231" w:hRule="atLeast"/>
+          <w:trHeight w:val="251" w:hRule="atLeast"/>
         </w:trPr>
         <w:tc>
           <w:tcPr>
@@ -30989,7 +31403,7 @@
           <w:shd w:val="clear" w:color="auto" w:fill="d0ddef"/>
         </w:tblPrEx>
         <w:trPr>
-          <w:trHeight w:val="231" w:hRule="atLeast"/>
+          <w:trHeight w:val="251" w:hRule="atLeast"/>
         </w:trPr>
         <w:tc>
           <w:tcPr>
@@ -31093,7 +31507,7 @@
           <w:shd w:val="clear" w:color="auto" w:fill="d0ddef"/>
         </w:tblPrEx>
         <w:trPr>
-          <w:trHeight w:val="231" w:hRule="atLeast"/>
+          <w:trHeight w:val="251" w:hRule="atLeast"/>
         </w:trPr>
         <w:tc>
           <w:tcPr>
@@ -31197,7 +31611,7 @@
           <w:shd w:val="clear" w:color="auto" w:fill="d0ddef"/>
         </w:tblPrEx>
         <w:trPr>
-          <w:trHeight w:val="231" w:hRule="atLeast"/>
+          <w:trHeight w:val="251" w:hRule="atLeast"/>
         </w:trPr>
         <w:tc>
           <w:tcPr>
@@ -31301,7 +31715,7 @@
           <w:shd w:val="clear" w:color="auto" w:fill="d0ddef"/>
         </w:tblPrEx>
         <w:trPr>
-          <w:trHeight w:val="231" w:hRule="atLeast"/>
+          <w:trHeight w:val="251" w:hRule="atLeast"/>
         </w:trPr>
         <w:tc>
           <w:tcPr>
@@ -31405,7 +31819,7 @@
           <w:shd w:val="clear" w:color="auto" w:fill="d0ddef"/>
         </w:tblPrEx>
         <w:trPr>
-          <w:trHeight w:val="231" w:hRule="atLeast"/>
+          <w:trHeight w:val="251" w:hRule="atLeast"/>
         </w:trPr>
         <w:tc>
           <w:tcPr>
@@ -31509,7 +31923,7 @@
           <w:shd w:val="clear" w:color="auto" w:fill="d0ddef"/>
         </w:tblPrEx>
         <w:trPr>
-          <w:trHeight w:val="231" w:hRule="atLeast"/>
+          <w:trHeight w:val="251" w:hRule="atLeast"/>
         </w:trPr>
         <w:tc>
           <w:tcPr>
@@ -31613,7 +32027,7 @@
           <w:shd w:val="clear" w:color="auto" w:fill="d0ddef"/>
         </w:tblPrEx>
         <w:trPr>
-          <w:trHeight w:val="231" w:hRule="atLeast"/>
+          <w:trHeight w:val="251" w:hRule="atLeast"/>
         </w:trPr>
         <w:tc>
           <w:tcPr>
@@ -31717,7 +32131,7 @@
           <w:shd w:val="clear" w:color="auto" w:fill="d0ddef"/>
         </w:tblPrEx>
         <w:trPr>
-          <w:trHeight w:val="231" w:hRule="atLeast"/>
+          <w:trHeight w:val="251" w:hRule="atLeast"/>
         </w:trPr>
         <w:tc>
           <w:tcPr>
@@ -31822,6 +32236,14 @@
         <w:pStyle w:val="Body A"/>
         <w:widowControl w:val="0"/>
         <w:spacing w:line="240" w:lineRule="auto"/>
+        <w:ind w:left="216" w:hanging="216"/>
+      </w:pPr>
+    </w:p>
+    <w:p>
+      <w:pPr>
+        <w:pStyle w:val="Body A"/>
+        <w:widowControl w:val="0"/>
+        <w:spacing w:line="240" w:lineRule="auto"/>
         <w:ind w:left="108" w:hanging="108"/>
       </w:pPr>
     </w:p>
@@ -31919,7 +32341,7 @@
       <w:tblPr>
         <w:tblW w:w="10440" w:type="dxa"/>
         <w:jc w:val="left"/>
-        <w:tblInd w:w="216" w:type="dxa"/>
+        <w:tblInd w:w="324" w:type="dxa"/>
         <w:tblBorders>
           <w:top w:val="single" w:color="ffffff" w:sz="8" w:space="0" w:shadow="0" w:frame="0"/>
           <w:left w:val="single" w:color="ffffff" w:sz="8" w:space="0" w:shadow="0" w:frame="0"/>
@@ -31941,7 +32363,7 @@
           <w:shd w:val="clear" w:color="auto" w:fill="d0ddef"/>
         </w:tblPrEx>
         <w:trPr>
-          <w:trHeight w:val="251" w:hRule="atLeast"/>
+          <w:trHeight w:val="271" w:hRule="atLeast"/>
         </w:trPr>
         <w:tc>
           <w:tcPr>
@@ -32101,7 +32523,7 @@
           <w:shd w:val="clear" w:color="auto" w:fill="d0ddef"/>
         </w:tblPrEx>
         <w:trPr>
-          <w:trHeight w:val="528" w:hRule="atLeast"/>
+          <w:trHeight w:val="548" w:hRule="atLeast"/>
         </w:trPr>
         <w:tc>
           <w:tcPr>
@@ -32236,7 +32658,7 @@
           <w:shd w:val="clear" w:color="auto" w:fill="d0ddef"/>
         </w:tblPrEx>
         <w:trPr>
-          <w:trHeight w:val="2785" w:hRule="atLeast"/>
+          <w:trHeight w:val="2805" w:hRule="atLeast"/>
         </w:trPr>
         <w:tc>
           <w:tcPr>
@@ -32291,9 +32713,6 @@
           <w:p>
             <w:pPr>
               <w:pStyle w:val="Body A"/>
-              <w:rPr>
-                <w:shd w:val="nil" w:color="auto" w:fill="auto"/>
-              </w:rPr>
             </w:pPr>
             <w:r>
               <w:rPr>
@@ -32364,15 +32783,9 @@
               </w:rPr>
               <w:t>- Customer</w:t>
             </w:r>
-          </w:p>
-          <w:p>
-            <w:pPr>
-              <w:pStyle w:val="Body A"/>
-            </w:pPr>
             <w:r>
               <w:rPr>
                 <w:shd w:val="nil" w:color="auto" w:fill="auto"/>
-                <w:lang w:val="pt-PT"/>
               </w:rPr>
             </w:r>
           </w:p>
@@ -32453,7 +32866,7 @@
           <w:shd w:val="clear" w:color="auto" w:fill="d0ddef"/>
         </w:tblPrEx>
         <w:trPr>
-          <w:trHeight w:val="5159" w:hRule="atLeast"/>
+          <w:trHeight w:val="5179" w:hRule="atLeast"/>
         </w:trPr>
         <w:tc>
           <w:tcPr>
@@ -32736,11 +33149,6 @@
               </w:rPr>
               <w:t>- SentEmails</w:t>
             </w:r>
-            <w:r>
-              <w:rPr>
-                <w:shd w:val="nil" w:color="auto" w:fill="auto"/>
-              </w:rPr>
-            </w:r>
           </w:p>
         </w:tc>
         <w:tc>
@@ -32827,6 +33235,14 @@
         <w:pStyle w:val="Body A"/>
         <w:widowControl w:val="0"/>
         <w:spacing w:line="240" w:lineRule="auto"/>
+        <w:ind w:left="216" w:hanging="216"/>
+      </w:pPr>
+    </w:p>
+    <w:p>
+      <w:pPr>
+        <w:pStyle w:val="Body A"/>
+        <w:widowControl w:val="0"/>
+        <w:spacing w:line="240" w:lineRule="auto"/>
         <w:ind w:left="108" w:hanging="108"/>
       </w:pPr>
     </w:p>
@@ -32891,7 +33307,7 @@
       <w:tblPr>
         <w:tblW w:w="10440" w:type="dxa"/>
         <w:jc w:val="left"/>
-        <w:tblInd w:w="216" w:type="dxa"/>
+        <w:tblInd w:w="324" w:type="dxa"/>
         <w:tblBorders>
           <w:top w:val="single" w:color="ffffff" w:sz="8" w:space="0" w:shadow="0" w:frame="0"/>
           <w:left w:val="single" w:color="ffffff" w:sz="8" w:space="0" w:shadow="0" w:frame="0"/>
@@ -32912,7 +33328,7 @@
           <w:shd w:val="clear" w:color="auto" w:fill="d0ddef"/>
         </w:tblPrEx>
         <w:trPr>
-          <w:trHeight w:val="251" w:hRule="atLeast"/>
+          <w:trHeight w:val="271" w:hRule="atLeast"/>
         </w:trPr>
         <w:tc>
           <w:tcPr>
@@ -33032,7 +33448,7 @@
           <w:shd w:val="clear" w:color="auto" w:fill="d0ddef"/>
         </w:tblPrEx>
         <w:trPr>
-          <w:trHeight w:val="251" w:hRule="atLeast"/>
+          <w:trHeight w:val="271" w:hRule="atLeast"/>
         </w:trPr>
         <w:tc>
           <w:tcPr>
@@ -33136,7 +33552,7 @@
           <w:shd w:val="clear" w:color="auto" w:fill="d0ddef"/>
         </w:tblPrEx>
         <w:trPr>
-          <w:trHeight w:val="528" w:hRule="atLeast"/>
+          <w:trHeight w:val="548" w:hRule="atLeast"/>
         </w:trPr>
         <w:tc>
           <w:tcPr>
@@ -33240,7 +33656,7 @@
           <w:shd w:val="clear" w:color="auto" w:fill="d0ddef"/>
         </w:tblPrEx>
         <w:trPr>
-          <w:trHeight w:val="251" w:hRule="atLeast"/>
+          <w:trHeight w:val="271" w:hRule="atLeast"/>
         </w:trPr>
         <w:tc>
           <w:tcPr>
@@ -33328,7 +33744,7 @@
           <w:shd w:val="clear" w:color="auto" w:fill="d0ddef"/>
         </w:tblPrEx>
         <w:trPr>
-          <w:trHeight w:val="251" w:hRule="atLeast"/>
+          <w:trHeight w:val="271" w:hRule="atLeast"/>
         </w:trPr>
         <w:tc>
           <w:tcPr>
@@ -33417,6 +33833,14 @@
         <w:pStyle w:val="Body A"/>
         <w:widowControl w:val="0"/>
         <w:spacing w:line="240" w:lineRule="auto"/>
+        <w:ind w:left="216" w:hanging="216"/>
+      </w:pPr>
+    </w:p>
+    <w:p>
+      <w:pPr>
+        <w:pStyle w:val="Body A"/>
+        <w:widowControl w:val="0"/>
+        <w:spacing w:line="240" w:lineRule="auto"/>
         <w:ind w:left="108" w:hanging="108"/>
       </w:pPr>
     </w:p>
@@ -33694,8 +34118,8 @@
         <w:drawing xmlns:a="http://schemas.openxmlformats.org/drawingml/2006/main">
           <wp:anchor distT="152400" distB="152400" distL="152400" distR="152400" simplePos="0" relativeHeight="251664384" behindDoc="0" locked="0" layoutInCell="1" allowOverlap="1">
             <wp:simplePos x="0" y="0"/>
-            <wp:positionH relativeFrom="margin">
-              <wp:posOffset>-6349</wp:posOffset>
+            <wp:positionH relativeFrom="page">
+              <wp:posOffset>450850</wp:posOffset>
             </wp:positionH>
             <wp:positionV relativeFrom="line">
               <wp:posOffset>173189</wp:posOffset>
@@ -33999,17 +34423,18 @@
       </w:r>
       <w:r>
         <w:rPr>
+          <w:rFonts w:ascii="Times New Roman" w:cs="Times New Roman" w:hAnsi="Times New Roman" w:eastAsia="Times New Roman"/>
           <w:b w:val="1"/>
           <w:bCs w:val="1"/>
         </w:rPr>
         <w:drawing xmlns:a="http://schemas.openxmlformats.org/drawingml/2006/main">
-          <wp:anchor distT="152400" distB="152400" distL="152400" distR="152400" simplePos="0" relativeHeight="251665408" behindDoc="0" locked="0" layoutInCell="1" allowOverlap="1">
+          <wp:anchor distT="0" distB="0" distL="0" distR="0" simplePos="0" relativeHeight="251665408" behindDoc="0" locked="0" layoutInCell="1" allowOverlap="1">
             <wp:simplePos x="0" y="0"/>
-            <wp:positionH relativeFrom="margin">
-              <wp:posOffset>-6349</wp:posOffset>
+            <wp:positionH relativeFrom="page">
+              <wp:posOffset>450850</wp:posOffset>
             </wp:positionH>
             <wp:positionV relativeFrom="line">
-              <wp:posOffset>170129</wp:posOffset>
+              <wp:posOffset>170128</wp:posOffset>
             </wp:positionV>
             <wp:extent cx="4076700" cy="1600200"/>
             <wp:effectExtent l="0" t="0" r="0" b="0"/>
@@ -34283,6 +34708,7 @@
       </w:r>
       <w:r>
         <w:rPr>
+          <w:rFonts w:ascii="Times New Roman" w:cs="Times New Roman" w:hAnsi="Times New Roman" w:eastAsia="Times New Roman"/>
           <w:b w:val="1"/>
           <w:bCs w:val="1"/>
           <w:lang w:val="pt-PT"/>
@@ -34290,11 +34716,11 @@
         <w:drawing xmlns:a="http://schemas.openxmlformats.org/drawingml/2006/main">
           <wp:anchor distT="152400" distB="152400" distL="152400" distR="152400" simplePos="0" relativeHeight="251666432" behindDoc="0" locked="0" layoutInCell="1" allowOverlap="1">
             <wp:simplePos x="0" y="0"/>
-            <wp:positionH relativeFrom="margin">
-              <wp:posOffset>1397000</wp:posOffset>
+            <wp:positionH relativeFrom="page">
+              <wp:posOffset>1854200</wp:posOffset>
             </wp:positionH>
             <wp:positionV relativeFrom="line">
-              <wp:posOffset>277329</wp:posOffset>
+              <wp:posOffset>277328</wp:posOffset>
             </wp:positionV>
             <wp:extent cx="3835400" cy="1231900"/>
             <wp:effectExtent l="0" t="0" r="0" b="0"/>
@@ -34530,14 +34956,15 @@
       </w:r>
       <w:r>
         <w:rPr>
+          <w:rFonts w:ascii="Times New Roman" w:cs="Times New Roman" w:hAnsi="Times New Roman" w:eastAsia="Times New Roman"/>
           <w:b w:val="1"/>
           <w:bCs w:val="1"/>
         </w:rPr>
         <w:drawing xmlns:a="http://schemas.openxmlformats.org/drawingml/2006/main">
           <wp:anchor distT="152400" distB="152400" distL="152400" distR="152400" simplePos="0" relativeHeight="251667456" behindDoc="0" locked="0" layoutInCell="1" allowOverlap="1">
             <wp:simplePos x="0" y="0"/>
-            <wp:positionH relativeFrom="margin">
-              <wp:posOffset>-6349</wp:posOffset>
+            <wp:positionH relativeFrom="page">
+              <wp:posOffset>450850</wp:posOffset>
             </wp:positionH>
             <wp:positionV relativeFrom="line">
               <wp:posOffset>148259</wp:posOffset>
@@ -34802,14 +35229,15 @@
       </w:r>
       <w:r>
         <w:rPr>
+          <w:rFonts w:ascii="Times New Roman" w:cs="Times New Roman" w:hAnsi="Times New Roman" w:eastAsia="Times New Roman"/>
           <w:b w:val="1"/>
           <w:bCs w:val="1"/>
         </w:rPr>
         <w:drawing xmlns:a="http://schemas.openxmlformats.org/drawingml/2006/main">
           <wp:anchor distT="152400" distB="152400" distL="152400" distR="152400" simplePos="0" relativeHeight="251668480" behindDoc="0" locked="0" layoutInCell="1" allowOverlap="1">
             <wp:simplePos x="0" y="0"/>
-            <wp:positionH relativeFrom="margin">
-              <wp:posOffset>-6349</wp:posOffset>
+            <wp:positionH relativeFrom="page">
+              <wp:posOffset>450850</wp:posOffset>
             </wp:positionH>
             <wp:positionV relativeFrom="line">
               <wp:posOffset>175729</wp:posOffset>
@@ -35097,14 +35525,15 @@
       </w:r>
       <w:r>
         <w:rPr>
+          <w:rFonts w:ascii="Times New Roman" w:cs="Times New Roman" w:hAnsi="Times New Roman" w:eastAsia="Times New Roman"/>
           <w:b w:val="1"/>
           <w:bCs w:val="1"/>
         </w:rPr>
         <w:drawing xmlns:a="http://schemas.openxmlformats.org/drawingml/2006/main">
           <wp:anchor distT="152400" distB="152400" distL="152400" distR="152400" simplePos="0" relativeHeight="251669504" behindDoc="0" locked="0" layoutInCell="1" allowOverlap="1">
             <wp:simplePos x="0" y="0"/>
-            <wp:positionH relativeFrom="margin">
-              <wp:posOffset>-6349</wp:posOffset>
+            <wp:positionH relativeFrom="page">
+              <wp:posOffset>450850</wp:posOffset>
             </wp:positionH>
             <wp:positionV relativeFrom="line">
               <wp:posOffset>168561</wp:posOffset>
@@ -35363,14 +35792,15 @@
       </w:r>
       <w:r>
         <w:rPr>
+          <w:rFonts w:ascii="Times New Roman" w:cs="Times New Roman" w:hAnsi="Times New Roman" w:eastAsia="Times New Roman"/>
           <w:b w:val="1"/>
           <w:bCs w:val="1"/>
         </w:rPr>
         <w:drawing xmlns:a="http://schemas.openxmlformats.org/drawingml/2006/main">
           <wp:anchor distT="152400" distB="152400" distL="152400" distR="152400" simplePos="0" relativeHeight="251670528" behindDoc="0" locked="0" layoutInCell="1" allowOverlap="1">
             <wp:simplePos x="0" y="0"/>
-            <wp:positionH relativeFrom="margin">
-              <wp:posOffset>-6350</wp:posOffset>
+            <wp:positionH relativeFrom="page">
+              <wp:posOffset>450850</wp:posOffset>
             </wp:positionH>
             <wp:positionV relativeFrom="line">
               <wp:posOffset>135089</wp:posOffset>
@@ -35685,14 +36115,15 @@
       </w:r>
       <w:r>
         <w:rPr>
+          <w:rFonts w:ascii="Times New Roman" w:cs="Times New Roman" w:hAnsi="Times New Roman" w:eastAsia="Times New Roman"/>
           <w:b w:val="1"/>
           <w:bCs w:val="1"/>
         </w:rPr>
         <w:drawing xmlns:a="http://schemas.openxmlformats.org/drawingml/2006/main">
           <wp:anchor distT="152400" distB="152400" distL="152400" distR="152400" simplePos="0" relativeHeight="251671552" behindDoc="0" locked="0" layoutInCell="1" allowOverlap="1">
             <wp:simplePos x="0" y="0"/>
-            <wp:positionH relativeFrom="margin">
-              <wp:posOffset>-6350</wp:posOffset>
+            <wp:positionH relativeFrom="page">
+              <wp:posOffset>450850</wp:posOffset>
             </wp:positionH>
             <wp:positionV relativeFrom="line">
               <wp:posOffset>185889</wp:posOffset>
@@ -36000,14 +36431,15 @@
       </w:r>
       <w:r>
         <w:rPr>
+          <w:rFonts w:ascii="Times New Roman" w:cs="Times New Roman" w:hAnsi="Times New Roman" w:eastAsia="Times New Roman"/>
           <w:b w:val="1"/>
           <w:bCs w:val="1"/>
         </w:rPr>
         <w:drawing xmlns:a="http://schemas.openxmlformats.org/drawingml/2006/main">
           <wp:anchor distT="152400" distB="152400" distL="152400" distR="152400" simplePos="0" relativeHeight="251672576" behindDoc="0" locked="0" layoutInCell="1" allowOverlap="1">
             <wp:simplePos x="0" y="0"/>
-            <wp:positionH relativeFrom="margin">
-              <wp:posOffset>77470</wp:posOffset>
+            <wp:positionH relativeFrom="page">
+              <wp:posOffset>534669</wp:posOffset>
             </wp:positionH>
             <wp:positionV relativeFrom="line">
               <wp:posOffset>181261</wp:posOffset>
@@ -36310,14 +36742,15 @@
       </w:r>
       <w:r>
         <w:rPr>
+          <w:rFonts w:ascii="Times New Roman" w:cs="Times New Roman" w:hAnsi="Times New Roman" w:eastAsia="Times New Roman"/>
           <w:b w:val="1"/>
           <w:bCs w:val="1"/>
         </w:rPr>
         <w:drawing xmlns:a="http://schemas.openxmlformats.org/drawingml/2006/main">
           <wp:anchor distT="152400" distB="152400" distL="152400" distR="152400" simplePos="0" relativeHeight="251673600" behindDoc="0" locked="0" layoutInCell="1" allowOverlap="1">
             <wp:simplePos x="0" y="0"/>
-            <wp:positionH relativeFrom="margin">
-              <wp:posOffset>-6349</wp:posOffset>
+            <wp:positionH relativeFrom="page">
+              <wp:posOffset>450850</wp:posOffset>
             </wp:positionH>
             <wp:positionV relativeFrom="line">
               <wp:posOffset>158128</wp:posOffset>
@@ -36641,14 +37074,15 @@
       </w:r>
       <w:r>
         <w:rPr>
+          <w:rFonts w:ascii="Times New Roman" w:cs="Times New Roman" w:hAnsi="Times New Roman" w:eastAsia="Times New Roman"/>
           <w:b w:val="1"/>
           <w:bCs w:val="1"/>
         </w:rPr>
         <w:drawing xmlns:a="http://schemas.openxmlformats.org/drawingml/2006/main">
           <wp:anchor distT="152400" distB="152400" distL="152400" distR="152400" simplePos="0" relativeHeight="251674624" behindDoc="0" locked="0" layoutInCell="1" allowOverlap="1">
             <wp:simplePos x="0" y="0"/>
-            <wp:positionH relativeFrom="margin">
-              <wp:posOffset>-6349</wp:posOffset>
+            <wp:positionH relativeFrom="page">
+              <wp:posOffset>450850</wp:posOffset>
             </wp:positionH>
             <wp:positionV relativeFrom="line">
               <wp:posOffset>217818</wp:posOffset>
@@ -36981,6 +37415,7 @@
       </w:r>
       <w:r>
         <w:rPr>
+          <w:rFonts w:ascii="Times New Roman" w:cs="Times New Roman" w:hAnsi="Times New Roman" w:eastAsia="Times New Roman"/>
           <w:b w:val="1"/>
           <w:bCs w:val="1"/>
           <w:lang w:val="pt-PT"/>
@@ -36988,8 +37423,8 @@
         <w:drawing xmlns:a="http://schemas.openxmlformats.org/drawingml/2006/main">
           <wp:anchor distT="152400" distB="152400" distL="152400" distR="152400" simplePos="0" relativeHeight="251675648" behindDoc="0" locked="0" layoutInCell="1" allowOverlap="1">
             <wp:simplePos x="0" y="0"/>
-            <wp:positionH relativeFrom="margin">
-              <wp:posOffset>73660</wp:posOffset>
+            <wp:positionH relativeFrom="page">
+              <wp:posOffset>530860</wp:posOffset>
             </wp:positionH>
             <wp:positionV relativeFrom="line">
               <wp:posOffset>145249</wp:posOffset>
@@ -37319,14 +37754,15 @@
       </w:r>
       <w:r>
         <w:rPr>
+          <w:rFonts w:ascii="Times New Roman" w:cs="Times New Roman" w:hAnsi="Times New Roman" w:eastAsia="Times New Roman"/>
           <w:b w:val="1"/>
           <w:bCs w:val="1"/>
         </w:rPr>
         <w:drawing xmlns:a="http://schemas.openxmlformats.org/drawingml/2006/main">
           <wp:anchor distT="152400" distB="152400" distL="152400" distR="152400" simplePos="0" relativeHeight="251676672" behindDoc="0" locked="0" layoutInCell="1" allowOverlap="1">
             <wp:simplePos x="0" y="0"/>
-            <wp:positionH relativeFrom="margin">
-              <wp:posOffset>-6350</wp:posOffset>
+            <wp:positionH relativeFrom="page">
+              <wp:posOffset>450850</wp:posOffset>
             </wp:positionH>
             <wp:positionV relativeFrom="line">
               <wp:posOffset>145249</wp:posOffset>
@@ -37623,19 +38059,20 @@
       </w:r>
       <w:r>
         <w:rPr>
+          <w:rFonts w:ascii="Times New Roman" w:cs="Times New Roman" w:hAnsi="Times New Roman" w:eastAsia="Times New Roman"/>
           <w:b w:val="1"/>
           <w:bCs w:val="1"/>
         </w:rPr>
         <w:drawing xmlns:a="http://schemas.openxmlformats.org/drawingml/2006/main">
           <wp:anchor distT="152400" distB="152400" distL="152400" distR="152400" simplePos="0" relativeHeight="251677696" behindDoc="0" locked="0" layoutInCell="1" allowOverlap="1">
             <wp:simplePos x="0" y="0"/>
-            <wp:positionH relativeFrom="margin">
-              <wp:posOffset>-6349</wp:posOffset>
+            <wp:positionH relativeFrom="page">
+              <wp:posOffset>450850</wp:posOffset>
             </wp:positionH>
             <wp:positionV relativeFrom="line">
               <wp:posOffset>141265</wp:posOffset>
             </wp:positionV>
-            <wp:extent cx="2884857" cy="919243"/>
+            <wp:extent cx="2884858" cy="919244"/>
             <wp:effectExtent l="0" t="0" r="0" b="0"/>
             <wp:wrapThrough wrapText="bothSides" distL="152400" distR="152400">
               <wp:wrapPolygon edited="1">
@@ -37668,7 +38105,7 @@
                   <pic:spPr>
                     <a:xfrm>
                       <a:off x="0" y="0"/>
-                      <a:ext cx="2884857" cy="919243"/>
+                      <a:ext cx="2884858" cy="919244"/>
                     </a:xfrm>
                     <a:prstGeom prst="rect">
                       <a:avLst/>
@@ -37875,7 +38312,6 @@
         <w:rPr>
           <w:b w:val="1"/>
           <w:bCs w:val="1"/>
-          <w:lang w:val="pt-PT"/>
         </w:rPr>
       </w:pPr>
       <w:r>
@@ -37925,6 +38361,7 @@
       </w:r>
       <w:r>
         <w:rPr>
+          <w:rFonts w:ascii="Times New Roman" w:cs="Times New Roman" w:hAnsi="Times New Roman" w:eastAsia="Times New Roman"/>
           <w:b w:val="1"/>
           <w:bCs w:val="1"/>
           <w:lang w:val="pt-PT"/>
@@ -37932,8 +38369,8 @@
         <w:drawing xmlns:a="http://schemas.openxmlformats.org/drawingml/2006/main">
           <wp:anchor distT="152400" distB="152400" distL="152400" distR="152400" simplePos="0" relativeHeight="251678720" behindDoc="0" locked="0" layoutInCell="1" allowOverlap="1">
             <wp:simplePos x="0" y="0"/>
-            <wp:positionH relativeFrom="margin">
-              <wp:posOffset>-6349</wp:posOffset>
+            <wp:positionH relativeFrom="page">
+              <wp:posOffset>450850</wp:posOffset>
             </wp:positionH>
             <wp:positionV relativeFrom="line">
               <wp:posOffset>141618</wp:posOffset>
@@ -37995,7 +38432,6 @@
         <w:rPr>
           <w:b w:val="1"/>
           <w:bCs w:val="1"/>
-          <w:lang w:val="pt-PT"/>
         </w:rPr>
       </w:pPr>
     </w:p>
@@ -39457,6 +39893,7 @@
       </w:pPr>
       <w:r>
         <w:rPr>
+          <w:rFonts w:ascii="Times New Roman" w:cs="Times New Roman" w:hAnsi="Times New Roman" w:eastAsia="Times New Roman"/>
           <w:b w:val="1"/>
           <w:bCs w:val="1"/>
           <w:lang w:val="it-IT"/>
@@ -39464,11 +39901,11 @@
         <w:drawing xmlns:a="http://schemas.openxmlformats.org/drawingml/2006/main">
           <wp:anchor distT="152400" distB="152400" distL="152400" distR="152400" simplePos="0" relativeHeight="251659264" behindDoc="0" locked="0" layoutInCell="1" allowOverlap="1">
             <wp:simplePos x="0" y="0"/>
-            <wp:positionH relativeFrom="margin">
-              <wp:posOffset>-6350</wp:posOffset>
+            <wp:positionH relativeFrom="page">
+              <wp:posOffset>450850</wp:posOffset>
             </wp:positionH>
             <wp:positionV relativeFrom="line">
-              <wp:posOffset>277329</wp:posOffset>
+              <wp:posOffset>277328</wp:posOffset>
             </wp:positionV>
             <wp:extent cx="6642100" cy="3591020"/>
             <wp:effectExtent l="0" t="0" r="0" b="0"/>
@@ -39550,6 +39987,7 @@
       </w:r>
       <w:r>
         <w:rPr>
+          <w:rFonts w:ascii="Times New Roman" w:cs="Times New Roman" w:hAnsi="Times New Roman" w:eastAsia="Times New Roman"/>
           <w:b w:val="1"/>
           <w:bCs w:val="1"/>
           <w:lang w:val="it-IT"/>
@@ -39557,11 +39995,11 @@
         <w:drawing xmlns:a="http://schemas.openxmlformats.org/drawingml/2006/main">
           <wp:anchor distT="152400" distB="152400" distL="152400" distR="152400" simplePos="0" relativeHeight="251660288" behindDoc="0" locked="0" layoutInCell="1" allowOverlap="1">
             <wp:simplePos x="0" y="0"/>
-            <wp:positionH relativeFrom="margin">
-              <wp:posOffset>-6350</wp:posOffset>
+            <wp:positionH relativeFrom="page">
+              <wp:posOffset>450850</wp:posOffset>
             </wp:positionH>
             <wp:positionV relativeFrom="line">
-              <wp:posOffset>277329</wp:posOffset>
+              <wp:posOffset>277328</wp:posOffset>
             </wp:positionV>
             <wp:extent cx="6642100" cy="1158985"/>
             <wp:effectExtent l="0" t="0" r="0" b="0"/>
@@ -39646,9 +40084,37 @@
         <w:rPr>
           <w:b w:val="1"/>
           <w:bCs w:val="1"/>
+          <w:lang w:val="en-US"/>
+        </w:rPr>
+      </w:pPr>
+      <w:r>
+        <w:rPr>
+          <w:b w:val="1"/>
+          <w:bCs w:val="1"/>
+          <w:rtl w:val="0"/>
+          <w:lang w:val="en-US"/>
+        </w:rPr>
+        <w:t>Validar uma venda e todos productos associados</w:t>
+      </w:r>
+    </w:p>
+    <w:p>
+      <w:pPr>
+        <w:pStyle w:val="Body A"/>
+        <w:rPr>
+          <w:b w:val="1"/>
+          <w:bCs w:val="1"/>
           <w:lang w:val="it-IT"/>
         </w:rPr>
       </w:pPr>
+    </w:p>
+    <w:p>
+      <w:pPr>
+        <w:pStyle w:val="Body A"/>
+        <w:rPr>
+          <w:b w:val="1"/>
+          <w:bCs w:val="1"/>
+        </w:rPr>
+      </w:pPr>
       <w:r>
         <w:rPr>
           <w:b w:val="1"/>
@@ -39656,39 +40122,11 @@
           <w:rtl w:val="0"/>
           <w:lang w:val="en-US"/>
         </w:rPr>
-        <w:t>Validar uma venda e todos productos associados</w:t>
-      </w:r>
-    </w:p>
-    <w:p>
-      <w:pPr>
-        <w:pStyle w:val="Body A"/>
-        <w:rPr>
-          <w:b w:val="1"/>
-          <w:bCs w:val="1"/>
-          <w:lang w:val="it-IT"/>
-        </w:rPr>
-      </w:pPr>
-    </w:p>
-    <w:p>
-      <w:pPr>
-        <w:pStyle w:val="Body A"/>
-        <w:rPr>
-          <w:b w:val="1"/>
-          <w:bCs w:val="1"/>
-          <w:lang w:val="it-IT"/>
-        </w:rPr>
-      </w:pPr>
-      <w:r>
-        <w:rPr>
-          <w:b w:val="1"/>
-          <w:bCs w:val="1"/>
-          <w:rtl w:val="0"/>
-          <w:lang w:val="en-US"/>
-        </w:rPr>
         <w:t>Legacy:</w:t>
       </w:r>
       <w:r>
         <w:rPr>
+          <w:rFonts w:ascii="Times New Roman" w:cs="Times New Roman" w:hAnsi="Times New Roman" w:eastAsia="Times New Roman"/>
           <w:b w:val="1"/>
           <w:bCs w:val="1"/>
           <w:lang w:val="it-IT"/>
@@ -39696,11 +40134,11 @@
         <w:drawing xmlns:a="http://schemas.openxmlformats.org/drawingml/2006/main">
           <wp:anchor distT="152400" distB="152400" distL="152400" distR="152400" simplePos="0" relativeHeight="251661312" behindDoc="0" locked="0" layoutInCell="1" allowOverlap="1">
             <wp:simplePos x="0" y="0"/>
-            <wp:positionH relativeFrom="margin">
-              <wp:posOffset>-6350</wp:posOffset>
+            <wp:positionH relativeFrom="page">
+              <wp:posOffset>450850</wp:posOffset>
             </wp:positionH>
             <wp:positionV relativeFrom="line">
-              <wp:posOffset>277329</wp:posOffset>
+              <wp:posOffset>277328</wp:posOffset>
             </wp:positionV>
             <wp:extent cx="6642100" cy="975702"/>
             <wp:effectExtent l="0" t="0" r="0" b="0"/>
@@ -39769,7 +40207,6 @@
         <w:rPr>
           <w:b w:val="1"/>
           <w:bCs w:val="1"/>
-          <w:lang w:val="it-IT"/>
         </w:rPr>
       </w:pPr>
       <w:r>
@@ -39783,6 +40220,7 @@
       </w:r>
       <w:r>
         <w:rPr>
+          <w:rFonts w:ascii="Times New Roman" w:cs="Times New Roman" w:hAnsi="Times New Roman" w:eastAsia="Times New Roman"/>
           <w:b w:val="1"/>
           <w:bCs w:val="1"/>
           <w:lang w:val="it-IT"/>
@@ -39790,13 +40228,13 @@
         <w:drawing xmlns:a="http://schemas.openxmlformats.org/drawingml/2006/main">
           <wp:anchor distT="152400" distB="152400" distL="152400" distR="152400" simplePos="0" relativeHeight="251662336" behindDoc="0" locked="0" layoutInCell="1" allowOverlap="1">
             <wp:simplePos x="0" y="0"/>
-            <wp:positionH relativeFrom="margin">
-              <wp:posOffset>-6350</wp:posOffset>
+            <wp:positionH relativeFrom="page">
+              <wp:posOffset>450850</wp:posOffset>
             </wp:positionH>
             <wp:positionV relativeFrom="line">
-              <wp:posOffset>277329</wp:posOffset>
+              <wp:posOffset>277328</wp:posOffset>
             </wp:positionV>
-            <wp:extent cx="6642100" cy="1006602"/>
+            <wp:extent cx="6642100" cy="1006603"/>
             <wp:effectExtent l="0" t="0" r="0" b="0"/>
             <wp:wrapThrough wrapText="bothSides" distL="152400" distR="152400">
               <wp:wrapPolygon edited="1">
@@ -39829,7 +40267,7 @@
                   <pic:spPr>
                     <a:xfrm>
                       <a:off x="0" y="0"/>
-                      <a:ext cx="6642100" cy="1006602"/>
+                      <a:ext cx="6642100" cy="1006603"/>
                     </a:xfrm>
                     <a:prstGeom prst="rect">
                       <a:avLst/>
@@ -39848,6 +40286,7 @@
       </w:r>
       <w:r>
         <w:rPr>
+          <w:rFonts w:ascii="Times New Roman" w:cs="Times New Roman" w:hAnsi="Times New Roman" w:eastAsia="Times New Roman"/>
           <w:b w:val="1"/>
           <w:bCs w:val="1"/>
           <w:lang w:val="it-IT"/>
@@ -39855,8 +40294,8 @@
         <w:drawing xmlns:a="http://schemas.openxmlformats.org/drawingml/2006/main">
           <wp:anchor distT="152400" distB="152400" distL="152400" distR="152400" simplePos="0" relativeHeight="251663360" behindDoc="0" locked="0" layoutInCell="1" allowOverlap="1">
             <wp:simplePos x="0" y="0"/>
-            <wp:positionH relativeFrom="margin">
-              <wp:posOffset>-6350</wp:posOffset>
+            <wp:positionH relativeFrom="page">
+              <wp:posOffset>450850</wp:posOffset>
             </wp:positionH>
             <wp:positionV relativeFrom="line">
               <wp:posOffset>1589570</wp:posOffset>
@@ -40023,7 +40462,7 @@
       <w:tblPr>
         <w:tblW w:w="11057" w:type="dxa"/>
         <w:jc w:val="left"/>
-        <w:tblInd w:w="216" w:type="dxa"/>
+        <w:tblInd w:w="324" w:type="dxa"/>
         <w:tblBorders>
           <w:top w:val="single" w:color="ffffff" w:sz="8" w:space="0" w:shadow="0" w:frame="0"/>
           <w:left w:val="single" w:color="ffffff" w:sz="8" w:space="0" w:shadow="0" w:frame="0"/>
@@ -40044,7 +40483,7 @@
           <w:shd w:val="clear" w:color="auto" w:fill="d0ddef"/>
         </w:tblPrEx>
         <w:trPr>
-          <w:trHeight w:val="251" w:hRule="atLeast"/>
+          <w:trHeight w:val="271" w:hRule="atLeast"/>
         </w:trPr>
         <w:tc>
           <w:tcPr>
@@ -40166,7 +40605,7 @@
           <w:shd w:val="clear" w:color="auto" w:fill="d0ddef"/>
         </w:tblPrEx>
         <w:trPr>
-          <w:trHeight w:val="251" w:hRule="atLeast"/>
+          <w:trHeight w:val="271" w:hRule="atLeast"/>
         </w:trPr>
         <w:tc>
           <w:tcPr>
@@ -40294,7 +40733,7 @@
           <w:shd w:val="clear" w:color="auto" w:fill="d0ddef"/>
         </w:tblPrEx>
         <w:trPr>
-          <w:trHeight w:val="251" w:hRule="atLeast"/>
+          <w:trHeight w:val="271" w:hRule="atLeast"/>
         </w:trPr>
         <w:tc>
           <w:tcPr>
@@ -40382,7 +40821,7 @@
           <w:shd w:val="clear" w:color="auto" w:fill="d0ddef"/>
         </w:tblPrEx>
         <w:trPr>
-          <w:trHeight w:val="965" w:hRule="atLeast"/>
+          <w:trHeight w:val="985" w:hRule="atLeast"/>
         </w:trPr>
         <w:tc>
           <w:tcPr>
@@ -40416,13 +40855,6 @@
                 <w:lang w:val="pt-PT"/>
               </w:rPr>
               <w:t>dbo.vw_SalesByCustomer</w:t>
-            </w:r>
-            <w:r>
-              <w:rPr>
-                <w:b w:val="1"/>
-                <w:bCs w:val="1"/>
-                <w:shd w:val="nil" w:color="auto" w:fill="auto"/>
-              </w:rPr>
             </w:r>
           </w:p>
         </w:tc>
@@ -40496,7 +40928,7 @@
           <w:shd w:val="clear" w:color="auto" w:fill="d0ddef"/>
         </w:tblPrEx>
         <w:trPr>
-          <w:trHeight w:val="360" w:hRule="atLeast"/>
+          <w:trHeight w:val="380" w:hRule="atLeast"/>
         </w:trPr>
         <w:tc>
           <w:tcPr>
@@ -40568,7 +41000,7 @@
           <w:shd w:val="clear" w:color="auto" w:fill="d0ddef"/>
         </w:tblPrEx>
         <w:trPr>
-          <w:trHeight w:val="360" w:hRule="atLeast"/>
+          <w:trHeight w:val="380" w:hRule="atLeast"/>
         </w:trPr>
         <w:tc>
           <w:tcPr>
@@ -40640,7 +41072,7 @@
           <w:shd w:val="clear" w:color="auto" w:fill="d0ddef"/>
         </w:tblPrEx>
         <w:trPr>
-          <w:trHeight w:val="360" w:hRule="atLeast"/>
+          <w:trHeight w:val="380" w:hRule="atLeast"/>
         </w:trPr>
         <w:tc>
           <w:tcPr>
@@ -40744,7 +41176,7 @@
           <w:shd w:val="clear" w:color="auto" w:fill="d0ddef"/>
         </w:tblPrEx>
         <w:trPr>
-          <w:trHeight w:val="528" w:hRule="atLeast"/>
+          <w:trHeight w:val="548" w:hRule="atLeast"/>
         </w:trPr>
         <w:tc>
           <w:tcPr>
@@ -40832,7 +41264,7 @@
           <w:shd w:val="clear" w:color="auto" w:fill="d0ddef"/>
         </w:tblPrEx>
         <w:trPr>
-          <w:trHeight w:val="528" w:hRule="atLeast"/>
+          <w:trHeight w:val="548" w:hRule="atLeast"/>
         </w:trPr>
         <w:tc>
           <w:tcPr>
@@ -40968,7 +41400,7 @@
           <w:shd w:val="clear" w:color="auto" w:fill="d0ddef"/>
         </w:tblPrEx>
         <w:trPr>
-          <w:trHeight w:val="528" w:hRule="atLeast"/>
+          <w:trHeight w:val="548" w:hRule="atLeast"/>
         </w:trPr>
         <w:tc>
           <w:tcPr>
@@ -41073,6 +41505,14 @@
         <w:pStyle w:val="Body A"/>
         <w:widowControl w:val="0"/>
         <w:spacing w:line="240" w:lineRule="auto"/>
+        <w:ind w:left="216" w:hanging="216"/>
+      </w:pPr>
+    </w:p>
+    <w:p>
+      <w:pPr>
+        <w:pStyle w:val="Body A"/>
+        <w:widowControl w:val="0"/>
+        <w:spacing w:line="240" w:lineRule="auto"/>
         <w:ind w:left="108" w:hanging="108"/>
       </w:pPr>
     </w:p>
@@ -41142,7 +41582,7 @@
       <w:tblPr>
         <w:tblW w:w="11057" w:type="dxa"/>
         <w:jc w:val="left"/>
-        <w:tblInd w:w="216" w:type="dxa"/>
+        <w:tblInd w:w="324" w:type="dxa"/>
         <w:tblBorders>
           <w:top w:val="single" w:color="ffffff" w:sz="8" w:space="0" w:shadow="0" w:frame="0"/>
           <w:left w:val="single" w:color="ffffff" w:sz="8" w:space="0" w:shadow="0" w:frame="0"/>
@@ -41165,7 +41605,7 @@
           <w:shd w:val="clear" w:color="auto" w:fill="d0ddef"/>
         </w:tblPrEx>
         <w:trPr>
-          <w:trHeight w:val="351" w:hRule="atLeast"/>
+          <w:trHeight w:val="371" w:hRule="atLeast"/>
         </w:trPr>
         <w:tc>
           <w:tcPr>
@@ -41369,7 +41809,7 @@
           <w:shd w:val="clear" w:color="auto" w:fill="d0ddef"/>
         </w:tblPrEx>
         <w:trPr>
-          <w:trHeight w:val="1082" w:hRule="atLeast"/>
+          <w:trHeight w:val="1102" w:hRule="atLeast"/>
         </w:trPr>
         <w:tc>
           <w:tcPr>
@@ -41589,7 +42029,7 @@
           <w:shd w:val="clear" w:color="auto" w:fill="d0ddef"/>
         </w:tblPrEx>
         <w:trPr>
-          <w:trHeight w:val="1082" w:hRule="atLeast"/>
+          <w:trHeight w:val="1102" w:hRule="atLeast"/>
         </w:trPr>
         <w:tc>
           <w:tcPr>
@@ -41807,7 +42247,7 @@
           <w:shd w:val="clear" w:color="auto" w:fill="d0ddef"/>
         </w:tblPrEx>
         <w:trPr>
-          <w:trHeight w:val="1912" w:hRule="atLeast"/>
+          <w:trHeight w:val="1932" w:hRule="atLeast"/>
         </w:trPr>
         <w:tc>
           <w:tcPr>
@@ -42026,6 +42466,14 @@
         <w:pStyle w:val="Body A"/>
         <w:widowControl w:val="0"/>
         <w:spacing w:line="240" w:lineRule="auto"/>
+        <w:ind w:left="216" w:hanging="216"/>
+      </w:pPr>
+    </w:p>
+    <w:p>
+      <w:pPr>
+        <w:pStyle w:val="Body A"/>
+        <w:widowControl w:val="0"/>
+        <w:spacing w:line="240" w:lineRule="auto"/>
         <w:ind w:left="108" w:hanging="108"/>
       </w:pPr>
     </w:p>
@@ -42150,7 +42598,7 @@
       <w:tblPr>
         <w:tblW w:w="11057" w:type="dxa"/>
         <w:jc w:val="left"/>
-        <w:tblInd w:w="216" w:type="dxa"/>
+        <w:tblInd w:w="324" w:type="dxa"/>
         <w:tblBorders>
           <w:top w:val="single" w:color="ffffff" w:sz="8" w:space="0" w:shadow="0" w:frame="0"/>
           <w:left w:val="single" w:color="ffffff" w:sz="8" w:space="0" w:shadow="0" w:frame="0"/>
@@ -42173,7 +42621,7 @@
           <w:shd w:val="clear" w:color="auto" w:fill="d0ddef"/>
         </w:tblPrEx>
         <w:trPr>
-          <w:trHeight w:val="528" w:hRule="atLeast"/>
+          <w:trHeight w:val="548" w:hRule="atLeast"/>
         </w:trPr>
         <w:tc>
           <w:tcPr>
@@ -42377,7 +42825,7 @@
           <w:shd w:val="clear" w:color="auto" w:fill="d0ddef"/>
         </w:tblPrEx>
         <w:trPr>
-          <w:trHeight w:val="1635" w:hRule="atLeast"/>
+          <w:trHeight w:val="1655" w:hRule="atLeast"/>
         </w:trPr>
         <w:tc>
           <w:tcPr>
@@ -42412,13 +42860,6 @@
                 <w:lang w:val="pt-PT"/>
               </w:rPr>
               <w:t>dbo.sp_send_email</w:t>
-            </w:r>
-            <w:r>
-              <w:rPr>
-                <w:b w:val="1"/>
-                <w:bCs w:val="1"/>
-                <w:shd w:val="nil" w:color="auto" w:fill="auto"/>
-              </w:rPr>
             </w:r>
           </w:p>
         </w:tc>
@@ -42527,7 +42968,7 @@
           <w:shd w:val="clear" w:color="auto" w:fill="d0ddef"/>
         </w:tblPrEx>
         <w:trPr>
-          <w:trHeight w:val="2465" w:hRule="atLeast"/>
+          <w:trHeight w:val="2485" w:hRule="atLeast"/>
         </w:trPr>
         <w:tc>
           <w:tcPr>
@@ -42562,13 +43003,6 @@
                 <w:lang w:val="pt-PT"/>
               </w:rPr>
               <w:t>dbo.sp_add_app_user</w:t>
-            </w:r>
-            <w:r>
-              <w:rPr>
-                <w:b w:val="1"/>
-                <w:bCs w:val="1"/>
-                <w:shd w:val="nil" w:color="auto" w:fill="auto"/>
-              </w:rPr>
             </w:r>
           </w:p>
         </w:tc>
@@ -42707,7 +43141,7 @@
           <w:shd w:val="clear" w:color="auto" w:fill="d0ddef"/>
         </w:tblPrEx>
         <w:trPr>
-          <w:trHeight w:val="1598" w:hRule="atLeast"/>
+          <w:trHeight w:val="1618" w:hRule="atLeast"/>
         </w:trPr>
         <w:tc>
           <w:tcPr>
@@ -42807,11 +43241,6 @@
               </w:rPr>
               <w:t>R10</w:t>
             </w:r>
-            <w:r>
-              <w:rPr>
-                <w:shd w:val="nil" w:color="auto" w:fill="auto"/>
-              </w:rPr>
-            </w:r>
           </w:p>
         </w:tc>
         <w:tc>
@@ -42852,7 +43281,7 @@
           <w:shd w:val="clear" w:color="auto" w:fill="d0ddef"/>
         </w:tblPrEx>
         <w:trPr>
-          <w:trHeight w:val="1125" w:hRule="atLeast"/>
+          <w:trHeight w:val="1145" w:hRule="atLeast"/>
         </w:trPr>
         <w:tc>
           <w:tcPr>
@@ -42952,11 +43381,6 @@
               </w:rPr>
               <w:t>R10</w:t>
             </w:r>
-            <w:r>
-              <w:rPr>
-                <w:shd w:val="nil" w:color="auto" w:fill="auto"/>
-              </w:rPr>
-            </w:r>
           </w:p>
         </w:tc>
         <w:tc>
@@ -43013,7 +43437,7 @@
           <w:shd w:val="clear" w:color="auto" w:fill="d0ddef"/>
         </w:tblPrEx>
         <w:trPr>
-          <w:trHeight w:val="1125" w:hRule="atLeast"/>
+          <w:trHeight w:val="1145" w:hRule="atLeast"/>
         </w:trPr>
         <w:tc>
           <w:tcPr>
@@ -43112,11 +43536,6 @@
               </w:rPr>
               <w:t>R10</w:t>
             </w:r>
-            <w:r>
-              <w:rPr>
-                <w:shd w:val="nil" w:color="auto" w:fill="auto"/>
-              </w:rPr>
-            </w:r>
           </w:p>
         </w:tc>
         <w:tc>
@@ -43157,7 +43576,7 @@
           <w:shd w:val="clear" w:color="auto" w:fill="d0ddef"/>
         </w:tblPrEx>
         <w:trPr>
-          <w:trHeight w:val="1125" w:hRule="atLeast"/>
+          <w:trHeight w:val="1145" w:hRule="atLeast"/>
         </w:trPr>
         <w:tc>
           <w:tcPr>
@@ -43256,11 +43675,6 @@
               </w:rPr>
               <w:t>R10</w:t>
             </w:r>
-            <w:r>
-              <w:rPr>
-                <w:shd w:val="nil" w:color="auto" w:fill="auto"/>
-              </w:rPr>
-            </w:r>
           </w:p>
         </w:tc>
         <w:tc>
@@ -43349,7 +43763,7 @@
           <w:shd w:val="clear" w:color="auto" w:fill="d0ddef"/>
         </w:tblPrEx>
         <w:trPr>
-          <w:trHeight w:val="1125" w:hRule="atLeast"/>
+          <w:trHeight w:val="1145" w:hRule="atLeast"/>
         </w:trPr>
         <w:tc>
           <w:tcPr>
@@ -43448,11 +43862,6 @@
               </w:rPr>
               <w:t>R10</w:t>
             </w:r>
-            <w:r>
-              <w:rPr>
-                <w:shd w:val="nil" w:color="auto" w:fill="auto"/>
-              </w:rPr>
-            </w:r>
           </w:p>
         </w:tc>
         <w:tc>
@@ -43493,7 +43902,7 @@
           <w:shd w:val="clear" w:color="auto" w:fill="d0ddef"/>
         </w:tblPrEx>
         <w:trPr>
-          <w:trHeight w:val="1082" w:hRule="atLeast"/>
+          <w:trHeight w:val="1102" w:hRule="atLeast"/>
         </w:trPr>
         <w:tc>
           <w:tcPr>
@@ -43728,6 +44137,14 @@
         <w:pStyle w:val="Body A"/>
         <w:widowControl w:val="0"/>
         <w:spacing w:line="240" w:lineRule="auto"/>
+        <w:ind w:left="216" w:hanging="216"/>
+      </w:pPr>
+    </w:p>
+    <w:p>
+      <w:pPr>
+        <w:pStyle w:val="Body A"/>
+        <w:widowControl w:val="0"/>
+        <w:spacing w:line="240" w:lineRule="auto"/>
         <w:ind w:left="108" w:hanging="108"/>
       </w:pPr>
     </w:p>
@@ -43770,7 +44187,7 @@
       <w:tblPr>
         <w:tblW w:w="11057" w:type="dxa"/>
         <w:jc w:val="left"/>
-        <w:tblInd w:w="216" w:type="dxa"/>
+        <w:tblInd w:w="324" w:type="dxa"/>
         <w:tblBorders>
           <w:top w:val="single" w:color="ffffff" w:sz="8" w:space="0" w:shadow="0" w:frame="0"/>
           <w:left w:val="single" w:color="ffffff" w:sz="8" w:space="0" w:shadow="0" w:frame="0"/>
@@ -43794,7 +44211,7 @@
           <w:shd w:val="clear" w:color="auto" w:fill="d0ddef"/>
         </w:tblPrEx>
         <w:trPr>
-          <w:trHeight w:val="528" w:hRule="atLeast"/>
+          <w:trHeight w:val="548" w:hRule="atLeast"/>
         </w:trPr>
         <w:tc>
           <w:tcPr>
@@ -44041,7 +44458,7 @@
           <w:shd w:val="clear" w:color="auto" w:fill="d0ddef"/>
         </w:tblPrEx>
         <w:trPr>
-          <w:trHeight w:val="528" w:hRule="atLeast"/>
+          <w:trHeight w:val="548" w:hRule="atLeast"/>
         </w:trPr>
         <w:tc>
           <w:tcPr>
@@ -44336,7 +44753,7 @@
           <w:shd w:val="clear" w:color="auto" w:fill="d0ddef"/>
         </w:tblPrEx>
         <w:trPr>
-          <w:trHeight w:val="528" w:hRule="atLeast"/>
+          <w:trHeight w:val="548" w:hRule="atLeast"/>
         </w:trPr>
         <w:tc>
           <w:tcPr>
@@ -44445,6 +44862,14 @@
         <w:pStyle w:val="Body A"/>
         <w:widowControl w:val="0"/>
         <w:spacing w:line="240" w:lineRule="auto"/>
+        <w:ind w:left="216" w:hanging="216"/>
+      </w:pPr>
+    </w:p>
+    <w:p>
+      <w:pPr>
+        <w:pStyle w:val="Body A"/>
+        <w:widowControl w:val="0"/>
+        <w:spacing w:line="240" w:lineRule="auto"/>
         <w:ind w:left="108" w:hanging="108"/>
       </w:pPr>
     </w:p>
@@ -44547,7 +44972,7 @@
       <w:tblPr>
         <w:tblW w:w="11057" w:type="dxa"/>
         <w:jc w:val="left"/>
-        <w:tblInd w:w="216" w:type="dxa"/>
+        <w:tblInd w:w="324" w:type="dxa"/>
         <w:tblBorders>
           <w:top w:val="single" w:color="ffffff" w:sz="8" w:space="0" w:shadow="0" w:frame="0"/>
           <w:left w:val="single" w:color="ffffff" w:sz="8" w:space="0" w:shadow="0" w:frame="0"/>
@@ -44569,7 +44994,7 @@
           <w:shd w:val="clear" w:color="auto" w:fill="d0ddef"/>
         </w:tblPrEx>
         <w:trPr>
-          <w:trHeight w:val="351" w:hRule="atLeast"/>
+          <w:trHeight w:val="371" w:hRule="atLeast"/>
         </w:trPr>
         <w:tc>
           <w:tcPr>
@@ -44733,7 +45158,7 @@
           <w:shd w:val="clear" w:color="auto" w:fill="d0ddef"/>
         </w:tblPrEx>
         <w:trPr>
-          <w:trHeight w:val="4366" w:hRule="atLeast"/>
+          <w:trHeight w:val="4386" w:hRule="atLeast"/>
         </w:trPr>
         <w:tc>
           <w:tcPr>
@@ -44938,7 +45363,7 @@
           <w:shd w:val="clear" w:color="auto" w:fill="d0ddef"/>
         </w:tblPrEx>
         <w:trPr>
-          <w:trHeight w:val="1082" w:hRule="atLeast"/>
+          <w:trHeight w:val="1102" w:hRule="atLeast"/>
         </w:trPr>
         <w:tc>
           <w:tcPr>
@@ -44973,13 +45398,6 @@
                 <w:lang w:val="pt-PT"/>
               </w:rPr>
               <w:t>dbo.sp_dbstatistics</w:t>
-            </w:r>
-            <w:r>
-              <w:rPr>
-                <w:b w:val="1"/>
-                <w:bCs w:val="1"/>
-                <w:shd w:val="nil" w:color="auto" w:fill="auto"/>
-              </w:rPr>
             </w:r>
           </w:p>
         </w:tc>
@@ -45130,6 +45548,26 @@
         </w:tc>
       </w:tr>
     </w:tbl>
+    <w:p>
+      <w:pPr>
+        <w:pStyle w:val="List Paragraph"/>
+        <w:widowControl w:val="0"/>
+        <w:spacing w:line="240" w:lineRule="auto"/>
+        <w:ind w:left="216" w:hanging="216"/>
+        <w:rPr>
+          <w:i w:val="1"/>
+          <w:iCs w:val="1"/>
+          <w:outline w:val="0"/>
+          <w:color w:val="a6a6a6"/>
+          <w:u w:color="a6a6a6"/>
+          <w14:textFill>
+            <w14:solidFill>
+              <w14:srgbClr w14:val="A6A6A6"/>
+            </w14:solidFill>
+          </w14:textFill>
+        </w:rPr>
+      </w:pPr>
+    </w:p>
     <w:p>
       <w:pPr>
         <w:pStyle w:val="List Paragraph"/>
@@ -47049,7 +47487,7 @@
         <w:tabs>
           <w:tab w:val="num" w:pos="1375"/>
         </w:tabs>
-        <w:ind w:left="1135" w:hanging="535"/>
+        <w:ind w:left="1135" w:hanging="536"/>
       </w:pPr>
       <w:rPr>
         <w:rFonts w:hAnsi="Arial Unicode MS"/>
@@ -47857,7 +48295,7 @@
           <w:tabs>
             <w:tab w:val="num" w:pos="1375"/>
           </w:tabs>
-          <w:ind w:left="1135" w:hanging="535"/>
+          <w:ind w:left="1135" w:hanging="536"/>
         </w:pPr>
         <w:rPr>
           <w:rFonts w:hAnsi="Arial Unicode MS"/>
@@ -48116,7 +48554,7 @@
           <w:tabs>
             <w:tab w:val="num" w:pos="1375"/>
           </w:tabs>
-          <w:ind w:left="1135" w:hanging="535"/>
+          <w:ind w:left="1135" w:hanging="536"/>
         </w:pPr>
         <w:rPr>
           <w:rFonts w:hAnsi="Arial Unicode MS"/>
@@ -48375,7 +48813,7 @@
           <w:tabs>
             <w:tab w:val="num" w:pos="1375"/>
           </w:tabs>
-          <w:ind w:left="1135" w:hanging="535"/>
+          <w:ind w:left="1135" w:hanging="536"/>
         </w:pPr>
         <w:rPr>
           <w:rFonts w:hAnsi="Arial Unicode MS"/>
@@ -48634,7 +49072,7 @@
           <w:tabs>
             <w:tab w:val="num" w:pos="1375"/>
           </w:tabs>
-          <w:ind w:left="1135" w:hanging="535"/>
+          <w:ind w:left="1135" w:hanging="536"/>
         </w:pPr>
         <w:rPr>
           <w:rFonts w:hAnsi="Arial Unicode MS"/>
@@ -50245,11 +50683,12 @@
       <w:position w:val="0"/>
       <w:sz w:val="28"/>
       <w:szCs w:val="28"/>
-      <w:u w:val="none"/>
+      <w:u w:val="none" w:color="000000"/>
       <w:shd w:val="nil" w:color="auto" w:fill="auto"/>
       <w:vertAlign w:val="baseline"/>
-      <w14:textOutline>
+      <w14:textOutline w14:w="12700" w14:cap="flat">
         <w14:noFill/>
+        <w14:miter w14:lim="400000"/>
       </w14:textOutline>
       <w14:textFill>
         <w14:solidFill>
@@ -50294,11 +50733,12 @@
       <w:position w:val="0"/>
       <w:sz w:val="28"/>
       <w:szCs w:val="28"/>
-      <w:u w:val="none"/>
+      <w:u w:val="none" w:color="000000"/>
       <w:shd w:val="nil" w:color="auto" w:fill="auto"/>
       <w:vertAlign w:val="baseline"/>
-      <w14:textOutline>
+      <w14:textOutline w14:w="12700" w14:cap="flat">
         <w14:noFill/>
+        <w14:miter w14:lim="400000"/>
       </w14:textOutline>
       <w14:textFill>
         <w14:solidFill>

</xml_diff>